<commit_message>
Replace generic comparison graphics with real workflow diagrams
Several figures felt generic (static checklists/comparisons) when the
underlying content was actually a process. Added three new workflow
diagrams (the overall self-publishing pipeline in Ch1, the editing
workflow in Ch4, the ad-campaign auto->manual cycle in Ch10) and
redesigned the ebook-vs-print and Select-vs-Wide figures as branching
workflow/decision diagrams instead of static two-column checklists.

Co-Authored-By: Claude Sonnet 5 <noreply@anthropic.com>
Claude-Session: https://claude.ai/code/session_01CjiNbHD9kxnVZrfy3mgwso
</commit_message>
<xml_diff>
--- a/How to Publish and Make Good Money/How to Publish and Make Good Money - Complete Manuscript.docx
+++ b/How to Publish and Make Good Money/How to Publish and Make Good Money - Complete Manuscript.docx
@@ -773,7 +773,7 @@
       </w:r>
     </w:p>
     <w:bookmarkEnd w:id="21"/>
-    <w:bookmarkStart w:id="34" w:name="part-i-the-landscape"/>
+    <w:bookmarkStart w:id="37" w:name="part-i-the-landscape"/>
     <w:p>
       <w:pPr>
         <w:pStyle w:val="Heading1"/>
@@ -782,7 +782,7 @@
         <w:t xml:space="preserve">Part I — The Landscape</w:t>
       </w:r>
     </w:p>
-    <w:bookmarkStart w:id="25" w:name="chapter-1-why-self-publish"/>
+    <w:bookmarkStart w:id="28" w:name="chapter-1-why-self-publish"/>
     <w:p>
       <w:pPr>
         <w:pStyle w:val="Heading2"/>
@@ -1181,7 +1181,7 @@
       </w:r>
     </w:p>
     <w:bookmarkEnd w:id="22"/>
-    <w:bookmarkStart w:id="23" w:name="Xe68f08bd59a101f334a3c7b46f7ae3c31eea1e4"/>
+    <w:bookmarkStart w:id="26" w:name="Xe68f08bd59a101f334a3c7b46f7ae3c31eea1e4"/>
     <w:p>
       <w:pPr>
         <w:pStyle w:val="Heading3"/>
@@ -1378,8 +1378,105 @@
         <w:t xml:space="preserve">for every author who uses it.</w:t>
       </w:r>
     </w:p>
-    <w:bookmarkEnd w:id="23"/>
-    <w:bookmarkStart w:id="24" w:name="a-note-on-doing-both"/>
+    <w:p>
+      <w:pPr>
+        <w:pStyle w:val="BodyText"/>
+      </w:pPr>
+      <w:r>
+        <w:t xml:space="preserve">Every chapter from here on is one stage of a single pipeline. It’s worth</w:t>
+      </w:r>
+      <w:r>
+        <w:t xml:space="preserve"> </w:t>
+      </w:r>
+      <w:r>
+        <w:t xml:space="preserve">seeing the whole shape before diving into the first piece of it:</w:t>
+      </w:r>
+    </w:p>
+    <w:p>
+      <w:pPr>
+        <w:pStyle w:val="FigureCaption"/>
+      </w:pPr>
+      <w:r>
+        <w:drawing>
+          <wp:inline>
+            <wp:extent cx="4013200" cy="5933410"/>
+            <wp:effectExtent b="0" l="0" r="0" t="0"/>
+            <wp:docPr descr="" title="" id="24" name="Picture"/>
+            <a:graphic>
+              <a:graphicData uri="http://schemas.openxmlformats.org/drawingml/2006/picture">
+                <pic:pic>
+                  <pic:nvPicPr>
+                    <pic:cNvPr descr="figures/fig01_publishing_workflow.png" id="25" name="Picture"/>
+                    <pic:cNvPicPr>
+                      <a:picLocks noChangeArrowheads="1" noChangeAspect="1"/>
+                    </pic:cNvPicPr>
+                  </pic:nvPicPr>
+                  <pic:blipFill>
+                    <a:blip r:embed="rId23"/>
+                    <a:stretch>
+                      <a:fillRect/>
+                    </a:stretch>
+                  </pic:blipFill>
+                  <pic:spPr bwMode="auto">
+                    <a:xfrm>
+                      <a:off x="0" y="0"/>
+                      <a:ext cx="4013200" cy="5933410"/>
+                    </a:xfrm>
+                    <a:prstGeom prst="rect">
+                      <a:avLst/>
+                    </a:prstGeom>
+                    <a:noFill/>
+                    <a:ln w="9525">
+                      <a:noFill/>
+                      <a:headEnd/>
+                      <a:tailEnd/>
+                    </a:ln>
+                  </pic:spPr>
+                </pic:pic>
+              </a:graphicData>
+            </a:graphic>
+          </wp:inline>
+        </w:drawing>
+      </w:r>
+    </w:p>
+    <w:p>
+      <w:pPr>
+        <w:pStyle w:val="FigureCaption"/>
+      </w:pPr>
+      <w:r>
+        <w:rPr>
+          <w:bCs/>
+          <w:b/>
+        </w:rPr>
+        <w:t xml:space="preserve">Figure 1.1</w:t>
+      </w:r>
+      <w:r>
+        <w:t xml:space="preserve"> </w:t>
+      </w:r>
+      <w:r>
+        <w:t xml:space="preserve">— The self-publishing workflow this book walks through, one</w:t>
+      </w:r>
+      <w:r>
+        <w:t xml:space="preserve"> </w:t>
+      </w:r>
+      <w:r>
+        <w:t xml:space="preserve">chapter at a time. Nothing here is optional; skipping a stage just means</w:t>
+      </w:r>
+      <w:r>
+        <w:t xml:space="preserve"> </w:t>
+      </w:r>
+      <w:r>
+        <w:t xml:space="preserve">finding out about it later, from a review or a royalty report instead of</w:t>
+      </w:r>
+      <w:r>
+        <w:t xml:space="preserve"> </w:t>
+      </w:r>
+      <w:r>
+        <w:t xml:space="preserve">from this book.</w:t>
+      </w:r>
+    </w:p>
+    <w:bookmarkEnd w:id="26"/>
+    <w:bookmarkStart w:id="27" w:name="a-note-on-doing-both"/>
     <w:p>
       <w:pPr>
         <w:pStyle w:val="Heading3"/>
@@ -1454,9 +1551,9 @@
         <w:t xml:space="preserve">you’d want from a publisher you were paying to do it for you.</w:t>
       </w:r>
     </w:p>
-    <w:bookmarkEnd w:id="24"/>
-    <w:bookmarkEnd w:id="25"/>
-    <w:bookmarkStart w:id="33" w:name="chapter-2-how-amazon-actually-pays-you"/>
+    <w:bookmarkEnd w:id="27"/>
+    <w:bookmarkEnd w:id="28"/>
+    <w:bookmarkStart w:id="36" w:name="chapter-2-how-amazon-actually-pays-you"/>
     <w:p>
       <w:pPr>
         <w:pStyle w:val="Heading2"/>
@@ -1503,7 +1600,7 @@
         <w:t xml:space="preserve">Get this part wrong and every later chapter inherits the error.</w:t>
       </w:r>
     </w:p>
-    <w:bookmarkStart w:id="29" w:name="the-ebook-royalty-two-plans-one-cliff"/>
+    <w:bookmarkStart w:id="32" w:name="the-ebook-royalty-two-plans-one-cliff"/>
     <w:p>
       <w:pPr>
         <w:pStyle w:val="Heading3"/>
@@ -1917,18 +2014,18 @@
           <wp:inline>
             <wp:extent cx="4013200" cy="2843771"/>
             <wp:effectExtent b="0" l="0" r="0" t="0"/>
-            <wp:docPr descr="" title="" id="27" name="Picture"/>
+            <wp:docPr descr="" title="" id="30" name="Picture"/>
             <a:graphic>
               <a:graphicData uri="http://schemas.openxmlformats.org/drawingml/2006/picture">
                 <pic:pic>
                   <pic:nvPicPr>
-                    <pic:cNvPr descr="figures/fig02_royalty_cliff.png" id="28" name="Picture"/>
+                    <pic:cNvPr descr="figures/fig02_royalty_cliff.png" id="31" name="Picture"/>
                     <pic:cNvPicPr>
                       <a:picLocks noChangeArrowheads="1" noChangeAspect="1"/>
                     </pic:cNvPicPr>
                   </pic:nvPicPr>
                   <pic:blipFill>
-                    <a:blip r:embed="rId26"/>
+                    <a:blip r:embed="rId29"/>
                     <a:stretch>
                       <a:fillRect/>
                     </a:stretch>
@@ -1985,8 +2082,8 @@
         <w:t xml:space="preserve">outside that band falls back to the flat 35% line.</w:t>
       </w:r>
     </w:p>
-    <w:bookmarkEnd w:id="29"/>
-    <w:bookmarkStart w:id="30" w:name="kindle-unlimited-and-the-page-read-fund"/>
+    <w:bookmarkEnd w:id="32"/>
+    <w:bookmarkStart w:id="33" w:name="kindle-unlimited-and-the-page-read-fund"/>
     <w:p>
       <w:pPr>
         <w:pStyle w:val="Heading3"/>
@@ -2219,8 +2316,8 @@
         <w:t xml:space="preserve">Chapter 12 answers.</w:t>
       </w:r>
     </w:p>
-    <w:bookmarkEnd w:id="30"/>
-    <w:bookmarkStart w:id="31" w:name="print-paperback-and-hardcover"/>
+    <w:bookmarkEnd w:id="33"/>
+    <w:bookmarkStart w:id="34" w:name="print-paperback-and-hardcover"/>
     <w:p>
       <w:pPr>
         <w:pStyle w:val="Heading3"/>
@@ -2505,8 +2602,8 @@
         <w:t xml:space="preserve">this book starts from the real number, not the advertised one.</w:t>
       </w:r>
     </w:p>
-    <w:bookmarkEnd w:id="31"/>
-    <w:bookmarkStart w:id="32" w:name="reading-your-own-numbers"/>
+    <w:bookmarkEnd w:id="34"/>
+    <w:bookmarkStart w:id="35" w:name="reading-your-own-numbers"/>
     <w:p>
       <w:pPr>
         <w:pStyle w:val="Heading3"/>
@@ -2603,10 +2700,10 @@
         <w:t xml:space="preserve">change in these numbers.</w:t>
       </w:r>
     </w:p>
-    <w:bookmarkEnd w:id="32"/>
-    <w:bookmarkEnd w:id="33"/>
-    <w:bookmarkEnd w:id="34"/>
-    <w:bookmarkStart w:id="57" w:name="part-ii-writing-and-producing-the-book"/>
+    <w:bookmarkEnd w:id="35"/>
+    <w:bookmarkEnd w:id="36"/>
+    <w:bookmarkEnd w:id="37"/>
+    <w:bookmarkStart w:id="63" w:name="part-ii-writing-and-producing-the-book"/>
     <w:p>
       <w:pPr>
         <w:pStyle w:val="Heading1"/>
@@ -2615,7 +2712,7 @@
         <w:t xml:space="preserve">Part II — Writing and Producing the Book</w:t>
       </w:r>
     </w:p>
-    <w:bookmarkStart w:id="38" w:name="chapter-3-choosing-what-to-write"/>
+    <w:bookmarkStart w:id="41" w:name="chapter-3-choosing-what-to-write"/>
     <w:p>
       <w:pPr>
         <w:pStyle w:val="Heading2"/>
@@ -2674,7 +2771,7 @@
         <w:t xml:space="preserve">as a research tool, instead of guessing.</w:t>
       </w:r>
     </w:p>
-    <w:bookmarkStart w:id="35" w:name="Xc81d673dad9bee37cd1f08a3335e6623c3f3c84"/>
+    <w:bookmarkStart w:id="38" w:name="Xc81d673dad9bee37cd1f08a3335e6623c3f3c84"/>
     <w:p>
       <w:pPr>
         <w:pStyle w:val="Heading3"/>
@@ -2949,8 +3046,8 @@
         <w:t xml:space="preserve">explained by someone who wanted it to be there. That gap is your outline.</w:t>
       </w:r>
     </w:p>
-    <w:bookmarkEnd w:id="35"/>
-    <w:bookmarkStart w:id="36" w:name="write-to-a-shelf-not-into-a-void"/>
+    <w:bookmarkEnd w:id="38"/>
+    <w:bookmarkStart w:id="39" w:name="write-to-a-shelf-not-into-a-void"/>
     <w:p>
       <w:pPr>
         <w:pStyle w:val="Heading3"/>
@@ -3163,8 +3260,8 @@
         <w:t xml:space="preserve">it, instead of asking a general browser to self-select from vague language.</w:t>
       </w:r>
     </w:p>
-    <w:bookmarkEnd w:id="36"/>
-    <w:bookmarkStart w:id="37" w:name="X6a3d2a2e3a156241cdebe5360930253989f642d"/>
+    <w:bookmarkEnd w:id="39"/>
+    <w:bookmarkStart w:id="40" w:name="X6a3d2a2e3a156241cdebe5360930253989f642d"/>
     <w:p>
       <w:pPr>
         <w:pStyle w:val="Heading3"/>
@@ -3389,9 +3486,9 @@
         <w:t xml:space="preserve">searching. Both take the same effort to write; only one reliably gets found.</w:t>
       </w:r>
     </w:p>
-    <w:bookmarkEnd w:id="37"/>
-    <w:bookmarkEnd w:id="38"/>
-    <w:bookmarkStart w:id="42" w:name="chapter-4-from-draft-to-manuscript"/>
+    <w:bookmarkEnd w:id="40"/>
+    <w:bookmarkEnd w:id="41"/>
+    <w:bookmarkStart w:id="48" w:name="chapter-4-from-draft-to-manuscript"/>
     <w:p>
       <w:pPr>
         <w:pStyle w:val="Heading2"/>
@@ -3438,7 +3535,7 @@
         <w:t xml:space="preserve">that person already knows what they meant to say.</w:t>
       </w:r>
     </w:p>
-    <w:bookmarkStart w:id="39" w:name="the-passes-in-order"/>
+    <w:bookmarkStart w:id="45" w:name="the-passes-in-order"/>
     <w:p>
       <w:pPr>
         <w:pStyle w:val="Heading3"/>
@@ -3671,1366 +3768,25 @@
     </w:p>
     <w:p>
       <w:pPr>
-        <w:pStyle w:val="CaseStudy"/>
-      </w:pPr>
-      <w:r>
-        <w:rPr>
-          <w:bCs/>
-          <w:b/>
-        </w:rPr>
-        <w:t xml:space="preserve">Case study: what</w:t>
-      </w:r>
-      <w:r>
-        <w:rPr>
-          <w:bCs/>
-          <w:b/>
-        </w:rPr>
-        <w:t xml:space="preserve"> </w:t>
-      </w:r>
-      <w:r>
-        <w:rPr>
-          <w:bCs/>
-          <w:b/>
-        </w:rPr>
-        <w:t xml:space="preserve">“</w:t>
-      </w:r>
-      <w:r>
-        <w:rPr>
-          <w:bCs/>
-          <w:b/>
-        </w:rPr>
-        <w:t xml:space="preserve">professional-grade</w:t>
-      </w:r>
-      <w:r>
-        <w:rPr>
-          <w:bCs/>
-          <w:b/>
-        </w:rPr>
-        <w:t xml:space="preserve">”</w:t>
-      </w:r>
-      <w:r>
-        <w:rPr>
-          <w:bCs/>
-          <w:b/>
-        </w:rPr>
-        <w:t xml:space="preserve"> </w:t>
-      </w:r>
-      <w:r>
-        <w:rPr>
-          <w:bCs/>
-          <w:b/>
-        </w:rPr>
-        <w:t xml:space="preserve">editing actually looks like in</w:t>
-      </w:r>
-      <w:r>
-        <w:rPr>
-          <w:bCs/>
-          <w:b/>
-        </w:rPr>
-        <w:t xml:space="preserve"> </w:t>
-      </w:r>
-      <w:r>
-        <w:rPr>
-          <w:bCs/>
-          <w:b/>
-        </w:rPr>
-        <w:t xml:space="preserve">practice.</w:t>
-      </w:r>
-      <w:r>
-        <w:t xml:space="preserve"> </w:t>
-      </w:r>
-      <w:r>
-        <w:t xml:space="preserve">Elsewhere in this same catalog, a 38-chapter technical book went</w:t>
-      </w:r>
-      <w:r>
-        <w:t xml:space="preserve"> </w:t>
-      </w:r>
-      <w:r>
-        <w:t xml:space="preserve">through</w:t>
-      </w:r>
-      <w:r>
-        <w:t xml:space="preserve"> </w:t>
-      </w:r>
-      <w:r>
-        <w:rPr>
-          <w:iCs/>
-          <w:i/>
-        </w:rPr>
-        <w:t xml:space="preserve">three separate independent review passes</w:t>
-      </w:r>
-      <w:r>
-        <w:t xml:space="preserve"> </w:t>
-      </w:r>
-      <w:r>
-        <w:t xml:space="preserve">after its first</w:t>
-      </w:r>
-      <w:r>
-        <w:t xml:space="preserve"> </w:t>
-      </w:r>
-      <w:r>
-        <w:t xml:space="preserve">“</w:t>
-      </w:r>
-      <w:r>
-        <w:t xml:space="preserve">complete</w:t>
-      </w:r>
-      <w:r>
-        <w:t xml:space="preserve">”</w:t>
-      </w:r>
-      <w:r>
-        <w:t xml:space="preserve"> </w:t>
-      </w:r>
-      <w:r>
-        <w:t xml:space="preserve">draft — each one specifically briefed to hunt for what the</w:t>
-      </w:r>
-      <w:r>
-        <w:t xml:space="preserve"> </w:t>
-      </w:r>
-      <w:r>
-        <w:t xml:space="preserve">previous pass missed rather than re-check settled items, each one</w:t>
-      </w:r>
-      <w:r>
-        <w:t xml:space="preserve"> </w:t>
-      </w:r>
-      <w:r>
-        <w:t xml:space="preserve">independently re-deriving every worked numerical example from scratch rather</w:t>
-      </w:r>
-      <w:r>
-        <w:t xml:space="preserve"> </w:t>
-      </w:r>
-      <w:r>
-        <w:t xml:space="preserve">than trusting the displayed answer. The three passes together found and fixed</w:t>
-      </w:r>
-      <w:r>
-        <w:t xml:space="preserve"> </w:t>
-      </w:r>
-      <w:r>
-        <w:t xml:space="preserve">13, then 21, then 18 confirmed issues — genuine arithmetic errors, a physics</w:t>
-      </w:r>
-      <w:r>
-        <w:t xml:space="preserve"> </w:t>
-      </w:r>
-      <w:r>
-        <w:t xml:space="preserve">claim that quietly contradicted the book’s own formula two paragraphs</w:t>
-      </w:r>
-      <w:r>
-        <w:t xml:space="preserve"> </w:t>
-      </w:r>
-      <w:r>
-        <w:t xml:space="preserve">earlier, cross-references pointing at the wrong chapter after a renumbering,</w:t>
-      </w:r>
-      <w:r>
-        <w:t xml:space="preserve"> </w:t>
-      </w:r>
-      <w:r>
-        <w:t xml:space="preserve">and (twice) a fix from an</w:t>
-      </w:r>
-      <w:r>
-        <w:t xml:space="preserve"> </w:t>
-      </w:r>
-      <w:r>
-        <w:rPr>
-          <w:iCs/>
-          <w:i/>
-        </w:rPr>
-        <w:t xml:space="preserve">earlier</w:t>
-      </w:r>
-      <w:r>
-        <w:t xml:space="preserve"> </w:t>
-      </w:r>
-      <w:r>
-        <w:t xml:space="preserve">pass that had itself introduced a new,</w:t>
-      </w:r>
-      <w:r>
-        <w:t xml:space="preserve"> </w:t>
-      </w:r>
-      <w:r>
-        <w:t xml:space="preserve">smaller inconsistency. A companion book in the same catalog ran a dedicated</w:t>
-      </w:r>
-      <w:r>
-        <w:t xml:space="preserve"> </w:t>
-      </w:r>
-      <w:r>
-        <w:t xml:space="preserve">mechanical sweep for overused qualifier words —</w:t>
-      </w:r>
-      <w:r>
-        <w:t xml:space="preserve"> </w:t>
-      </w:r>
-      <w:r>
-        <w:t xml:space="preserve">“</w:t>
-      </w:r>
-      <w:r>
-        <w:t xml:space="preserve">roughly,</w:t>
-      </w:r>
-      <w:r>
-        <w:t xml:space="preserve">”</w:t>
-      </w:r>
-      <w:r>
-        <w:t xml:space="preserve"> </w:t>
-      </w:r>
-      <w:r>
-        <w:t xml:space="preserve">“</w:t>
-      </w:r>
-      <w:r>
-        <w:t xml:space="preserve">essentially,</w:t>
-      </w:r>
-      <w:r>
-        <w:t xml:space="preserve">”</w:t>
-      </w:r>
-      <w:r>
-        <w:t xml:space="preserve"> </w:t>
-      </w:r>
-      <w:r>
-        <w:t xml:space="preserve">“</w:t>
-      </w:r>
-      <w:r>
-        <w:t xml:space="preserve">itself</w:t>
-      </w:r>
-      <w:r>
-        <w:t xml:space="preserve">”</w:t>
-      </w:r>
-      <w:r>
-        <w:t xml:space="preserve"> </w:t>
-      </w:r>
-      <w:r>
-        <w:t xml:space="preserve">— appearing twice on the same page, catching 111 instances a normal</w:t>
-      </w:r>
-      <w:r>
-        <w:t xml:space="preserve"> </w:t>
-      </w:r>
-      <w:r>
-        <w:t xml:space="preserve">read-through had sailed past every time, because a reader’s eye and a</w:t>
-      </w:r>
-      <w:r>
-        <w:t xml:space="preserve"> </w:t>
-      </w:r>
-      <w:r>
-        <w:t xml:space="preserve">targeted script are looking for different things. The lesson isn’t</w:t>
-      </w:r>
-      <w:r>
-        <w:t xml:space="preserve"> </w:t>
-      </w:r>
-      <w:r>
-        <w:t xml:space="preserve">“</w:t>
-      </w:r>
-      <w:r>
-        <w:t xml:space="preserve">hire</w:t>
-      </w:r>
-      <w:r>
-        <w:t xml:space="preserve"> </w:t>
-      </w:r>
-      <w:r>
-        <w:t xml:space="preserve">three editors</w:t>
-      </w:r>
-      <w:r>
-        <w:t xml:space="preserve">”</w:t>
-      </w:r>
-      <w:r>
-        <w:t xml:space="preserve"> </w:t>
-      </w:r>
-      <w:r>
-        <w:t xml:space="preserve">if your budget doesn’t allow it — it’s that</w:t>
-      </w:r>
-      <w:r>
-        <w:t xml:space="preserve"> </w:t>
-      </w:r>
-      <w:r>
-        <w:rPr>
-          <w:bCs/>
-          <w:b/>
-        </w:rPr>
-        <w:t xml:space="preserve">the errors</w:t>
-      </w:r>
-      <w:r>
-        <w:rPr>
-          <w:bCs/>
-          <w:b/>
-        </w:rPr>
-        <w:t xml:space="preserve"> </w:t>
-      </w:r>
-      <w:r>
-        <w:rPr>
-          <w:bCs/>
-          <w:b/>
-        </w:rPr>
-        <w:t xml:space="preserve">still in your manuscript after one careful read are, almost by definition,</w:t>
-      </w:r>
-      <w:r>
-        <w:rPr>
-          <w:bCs/>
-          <w:b/>
-        </w:rPr>
-        <w:t xml:space="preserve"> </w:t>
-      </w:r>
-      <w:r>
-        <w:rPr>
-          <w:bCs/>
-          <w:b/>
-        </w:rPr>
-        <w:t xml:space="preserve">the ones a normal read doesn’t catch.</w:t>
-      </w:r>
-      <w:r>
-        <w:t xml:space="preserve"> </w:t>
-      </w:r>
-      <w:r>
-        <w:t xml:space="preserve">Budget at least one pass that is</w:t>
-      </w:r>
-      <w:r>
-        <w:t xml:space="preserve"> </w:t>
-      </w:r>
-      <w:r>
-        <w:t xml:space="preserve">specifically</w:t>
-      </w:r>
-      <w:r>
-        <w:t xml:space="preserve"> </w:t>
-      </w:r>
-      <w:r>
-        <w:rPr>
-          <w:iCs/>
-          <w:i/>
-        </w:rPr>
-        <w:t xml:space="preserve">not</w:t>
-      </w:r>
-      <w:r>
-        <w:t xml:space="preserve"> </w:t>
-      </w:r>
-      <w:r>
-        <w:t xml:space="preserve">just reading the book again: a fact-check pass, a</w:t>
-      </w:r>
-      <w:r>
-        <w:t xml:space="preserve"> </w:t>
-      </w:r>
-      <w:r>
-        <w:t xml:space="preserve">consistency script, a reader who has never seen the manuscript before.</w:t>
-      </w:r>
-    </w:p>
-    <w:bookmarkEnd w:id="39"/>
-    <w:bookmarkStart w:id="40" w:name="X72d8730a9c8c3129ddaea5a55d3df5a49b8a18c"/>
-    <w:p>
-      <w:pPr>
-        <w:pStyle w:val="Heading3"/>
-      </w:pPr>
-      <w:r>
-        <w:t xml:space="preserve">Where AI genuinely helps, and where the line is</w:t>
-      </w:r>
-    </w:p>
-    <w:p>
-      <w:pPr>
-        <w:pStyle w:val="FirstParagraph"/>
-      </w:pPr>
-      <w:r>
-        <w:t xml:space="preserve">Used well, AI tools can speed up the unglamorous parts of this process: a</w:t>
-      </w:r>
-      <w:r>
-        <w:t xml:space="preserve"> </w:t>
-      </w:r>
-      <w:r>
-        <w:t xml:space="preserve">first-pass consistency check across hundreds of pages, generating several</w:t>
-      </w:r>
-      <w:r>
-        <w:t xml:space="preserve"> </w:t>
-      </w:r>
-      <w:r>
-        <w:t xml:space="preserve">alternative phrasings of an awkward paragraph for you to choose between and</w:t>
-      </w:r>
-      <w:r>
-        <w:t xml:space="preserve"> </w:t>
-      </w:r>
-      <w:r>
-        <w:t xml:space="preserve">rewrite, condensing research notes, or catching a subset of the kind of</w:t>
-      </w:r>
-      <w:r>
-        <w:t xml:space="preserve"> </w:t>
-      </w:r>
-      <w:r>
-        <w:t xml:space="preserve">mechanical errors described above. Used badly, it becomes the entire book —</w:t>
-      </w:r>
-      <w:r>
-        <w:t xml:space="preserve"> </w:t>
-      </w:r>
-      <w:r>
-        <w:t xml:space="preserve">a prompt, minimal human review, and a KDP upload — and readers have gotten</w:t>
-      </w:r>
-      <w:r>
-        <w:t xml:space="preserve"> </w:t>
-      </w:r>
-      <w:r>
-        <w:t xml:space="preserve">noticeably better at spotting the tell-tale flatness of that approach, which</w:t>
-      </w:r>
-      <w:r>
-        <w:t xml:space="preserve"> </w:t>
-      </w:r>
-      <w:r>
-        <w:t xml:space="preserve">shows up in review sections as a specific and damaging complaint.</w:t>
-      </w:r>
-    </w:p>
-    <w:p>
-      <w:pPr>
-        <w:pStyle w:val="BodyText"/>
-      </w:pPr>
-      <w:r>
-        <w:t xml:space="preserve">Two things are not optional, regardless of how much AI assistance you use in</w:t>
-      </w:r>
-      <w:r>
-        <w:t xml:space="preserve"> </w:t>
-      </w:r>
-      <w:r>
-        <w:t xml:space="preserve">your process:</w:t>
-      </w:r>
-    </w:p>
-    <w:p>
-      <w:pPr>
-        <w:numPr>
-          <w:ilvl w:val="0"/>
-          <w:numId w:val="1006"/>
-        </w:numPr>
-        <w:pStyle w:val="Compact"/>
-      </w:pPr>
-      <w:r>
-        <w:rPr>
-          <w:bCs/>
-          <w:b/>
-        </w:rPr>
-        <w:t xml:space="preserve">Amazon requires disclosure.</w:t>
-      </w:r>
-      <w:r>
-        <w:t xml:space="preserve"> </w:t>
-      </w:r>
-      <w:r>
-        <w:t xml:space="preserve">KDP’s publishing questionnaire asks you to</w:t>
-      </w:r>
-      <w:r>
-        <w:t xml:space="preserve"> </w:t>
-      </w:r>
-      <w:r>
-        <w:t xml:space="preserve">declare whether a title contains AI-generated text, images, or</w:t>
-      </w:r>
-      <w:r>
-        <w:t xml:space="preserve"> </w:t>
-      </w:r>
-      <w:r>
-        <w:t xml:space="preserve">translation, and misrepresenting that is a content-policy violation, not a</w:t>
-      </w:r>
-      <w:r>
-        <w:t xml:space="preserve"> </w:t>
-      </w:r>
-      <w:r>
-        <w:t xml:space="preserve">gray area. Answer it honestly.</w:t>
-      </w:r>
-    </w:p>
-    <w:p>
-      <w:pPr>
-        <w:numPr>
-          <w:ilvl w:val="0"/>
-          <w:numId w:val="1006"/>
-        </w:numPr>
-        <w:pStyle w:val="Compact"/>
-      </w:pPr>
-      <w:r>
-        <w:rPr>
-          <w:bCs/>
-          <w:b/>
-        </w:rPr>
-        <w:t xml:space="preserve">A human has to be the last editorial judgment.</w:t>
-      </w:r>
-      <w:r>
-        <w:t xml:space="preserve"> </w:t>
-      </w:r>
-      <w:r>
-        <w:t xml:space="preserve">Whatever tools condense,</w:t>
-      </w:r>
-      <w:r>
-        <w:t xml:space="preserve"> </w:t>
-      </w:r>
-      <w:r>
-        <w:t xml:space="preserve">draft, or suggest, the decision that a sentence is accurate, that an</w:t>
-      </w:r>
-      <w:r>
-        <w:t xml:space="preserve"> </w:t>
-      </w:r>
-      <w:r>
-        <w:t xml:space="preserve">example is correct, and that a chapter says what you actually mean has to</w:t>
-      </w:r>
-      <w:r>
-        <w:t xml:space="preserve"> </w:t>
-      </w:r>
-      <w:r>
-        <w:t xml:space="preserve">be made by a person who is accountable for it — which in practice means</w:t>
-      </w:r>
-      <w:r>
-        <w:t xml:space="preserve"> </w:t>
-      </w:r>
-      <w:r>
-        <w:t xml:space="preserve">the fact-check and consistency passes above are not optional just because</w:t>
-      </w:r>
-      <w:r>
-        <w:t xml:space="preserve"> </w:t>
-      </w:r>
-      <w:r>
-        <w:t xml:space="preserve">a tool helped write the first draft.</w:t>
-      </w:r>
-    </w:p>
-    <w:bookmarkEnd w:id="40"/>
-    <w:bookmarkStart w:id="41" w:name="a-minimum-revision-checklist"/>
-    <w:p>
-      <w:pPr>
-        <w:pStyle w:val="Heading3"/>
-      </w:pPr>
-      <w:r>
-        <w:t xml:space="preserve">A minimum revision checklist</w:t>
-      </w:r>
-    </w:p>
-    <w:p>
-      <w:pPr>
-        <w:pStyle w:val="FirstParagraph"/>
-      </w:pPr>
-      <w:r>
-        <w:t xml:space="preserve">If you do nothing else before publishing, do these:</w:t>
-      </w:r>
-    </w:p>
-    <w:p>
-      <w:pPr>
-        <w:numPr>
-          <w:ilvl w:val="0"/>
-          <w:numId w:val="1007"/>
-        </w:numPr>
-        <w:pStyle w:val="Compact"/>
-      </w:pPr>
-      <w:r>
-        <w:rPr>
-          <w:bCs/>
-          <w:b/>
-        </w:rPr>
-        <w:t xml:space="preserve">Read it aloud, or have text-to-speech read it to you.</w:t>
-      </w:r>
-      <w:r>
-        <w:t xml:space="preserve"> </w:t>
-      </w:r>
-      <w:r>
-        <w:t xml:space="preserve">Your ear catches</w:t>
-      </w:r>
-      <w:r>
-        <w:t xml:space="preserve"> </w:t>
-      </w:r>
-      <w:r>
-        <w:t xml:space="preserve">rhythm problems and repeated words your eye slides past.</w:t>
-      </w:r>
-    </w:p>
-    <w:p>
-      <w:pPr>
-        <w:numPr>
-          <w:ilvl w:val="0"/>
-          <w:numId w:val="1007"/>
-        </w:numPr>
-        <w:pStyle w:val="Compact"/>
-      </w:pPr>
-      <w:r>
-        <w:rPr>
-          <w:bCs/>
-          <w:b/>
-        </w:rPr>
-        <w:t xml:space="preserve">Check every number and every cross-reference.</w:t>
-      </w:r>
-      <w:r>
-        <w:t xml:space="preserve"> </w:t>
-      </w:r>
-      <w:r>
-        <w:t xml:space="preserve">“</w:t>
-      </w:r>
-      <w:r>
-        <w:t xml:space="preserve">As shown in Chapter 4</w:t>
-      </w:r>
-      <w:r>
-        <w:t xml:space="preserve">”</w:t>
-      </w:r>
-      <w:r>
-        <w:t xml:space="preserve"> </w:t>
-      </w:r>
-      <w:r>
-        <w:t xml:space="preserve">needs to actually be Chapter 4, still, after every reorganization.</w:t>
-      </w:r>
-    </w:p>
-    <w:p>
-      <w:pPr>
-        <w:numPr>
-          <w:ilvl w:val="0"/>
-          <w:numId w:val="1007"/>
-        </w:numPr>
-        <w:pStyle w:val="Compact"/>
-      </w:pPr>
-      <w:r>
-        <w:rPr>
-          <w:bCs/>
-          <w:b/>
-        </w:rPr>
-        <w:t xml:space="preserve">Run one adversarial pass.</w:t>
-      </w:r>
-      <w:r>
-        <w:t xml:space="preserve"> </w:t>
-      </w:r>
-      <w:r>
-        <w:t xml:space="preserve">Read it once specifically looking for ways</w:t>
-      </w:r>
-      <w:r>
-        <w:t xml:space="preserve"> </w:t>
-      </w:r>
-      <w:r>
-        <w:t xml:space="preserve">to be wrong — a claim you can’t actually back up, a promise the book</w:t>
-      </w:r>
-      <w:r>
-        <w:t xml:space="preserve"> </w:t>
-      </w:r>
-      <w:r>
-        <w:t xml:space="preserve">doesn’t deliver on, a contradiction between an early chapter and a later</w:t>
-      </w:r>
-      <w:r>
-        <w:t xml:space="preserve"> </w:t>
-      </w:r>
-      <w:r>
-        <w:t xml:space="preserve">one.</w:t>
-      </w:r>
-    </w:p>
-    <w:p>
-      <w:pPr>
-        <w:numPr>
-          <w:ilvl w:val="0"/>
-          <w:numId w:val="1007"/>
-        </w:numPr>
-        <w:pStyle w:val="Compact"/>
-      </w:pPr>
-      <w:r>
-        <w:rPr>
-          <w:bCs/>
-          <w:b/>
-        </w:rPr>
-        <w:t xml:space="preserve">Get at least one outside reader</w:t>
-      </w:r>
-      <w:r>
-        <w:t xml:space="preserve"> </w:t>
-      </w:r>
-      <w:r>
-        <w:t xml:space="preserve">who has never seen the manuscript</w:t>
-      </w:r>
-      <w:r>
-        <w:t xml:space="preserve"> </w:t>
-      </w:r>
-      <w:r>
-        <w:t xml:space="preserve">before, and ask them specifically where they got confused or bored, not</w:t>
-      </w:r>
-      <w:r>
-        <w:t xml:space="preserve"> </w:t>
-      </w:r>
-      <w:r>
-        <w:t xml:space="preserve">just whether they</w:t>
-      </w:r>
-      <w:r>
-        <w:t xml:space="preserve"> </w:t>
-      </w:r>
-      <w:r>
-        <w:t xml:space="preserve">“</w:t>
-      </w:r>
-      <w:r>
-        <w:t xml:space="preserve">liked it.</w:t>
-      </w:r>
-      <w:r>
-        <w:t xml:space="preserve">”</w:t>
-      </w:r>
-    </w:p>
-    <w:bookmarkEnd w:id="41"/>
-    <w:bookmarkEnd w:id="42"/>
-    <w:bookmarkStart w:id="48" w:name="Xc7622a188585e28435401aff35a225d1040f6f2"/>
-    <w:p>
-      <w:pPr>
-        <w:pStyle w:val="Heading2"/>
-      </w:pPr>
-      <w:r>
-        <w:t xml:space="preserve">Chapter 5: Formatting That Doesn’t Break Kindle</w:t>
-      </w:r>
-    </w:p>
-    <w:p>
-      <w:pPr>
-        <w:pStyle w:val="FirstParagraph"/>
-      </w:pPr>
-      <w:r>
-        <w:t xml:space="preserve">Ebook formatting and print formatting are not the same job wearing two hats —</w:t>
-      </w:r>
-      <w:r>
-        <w:t xml:space="preserve"> </w:t>
-      </w:r>
-      <w:r>
-        <w:t xml:space="preserve">they solve different problems, and treating one file as automatically</w:t>
-      </w:r>
-      <w:r>
-        <w:t xml:space="preserve"> </w:t>
-      </w:r>
-      <w:r>
-        <w:t xml:space="preserve">correct for both formats is where a lot of self-published books develop</w:t>
-      </w:r>
-      <w:r>
-        <w:t xml:space="preserve"> </w:t>
-      </w:r>
-      <w:r>
-        <w:t xml:space="preserve">avoidable, embarrassing bugs (a page-number reference in a book with no</w:t>
-      </w:r>
-      <w:r>
-        <w:t xml:space="preserve"> </w:t>
-      </w:r>
-      <w:r>
-        <w:t xml:space="preserve">fixed pages, a table of contents with no working links, a paperback with no</w:t>
-      </w:r>
-      <w:r>
-        <w:t xml:space="preserve"> </w:t>
-      </w:r>
-      <w:r>
-        <w:t xml:space="preserve">page numbers at all).</w:t>
-      </w:r>
-    </w:p>
-    <w:bookmarkStart w:id="43" w:name="ebooks-let-kindle-do-the-navigation"/>
-    <w:p>
-      <w:pPr>
-        <w:pStyle w:val="Heading3"/>
-      </w:pPr>
-      <w:r>
-        <w:t xml:space="preserve">Ebooks: let Kindle do the navigation</w:t>
-      </w:r>
-    </w:p>
-    <w:p>
-      <w:pPr>
-        <w:pStyle w:val="FirstParagraph"/>
-      </w:pPr>
-      <w:r>
-        <w:t xml:space="preserve">A Kindle reader can change font size, font, and line spacing, which means</w:t>
-      </w:r>
-      <w:r>
-        <w:t xml:space="preserve"> </w:t>
-      </w:r>
-      <w:r>
-        <w:t xml:space="preserve">your ebook has no fixed pages —</w:t>
-      </w:r>
-      <w:r>
-        <w:t xml:space="preserve"> </w:t>
-      </w:r>
-      <w:r>
-        <w:t xml:space="preserve">“</w:t>
-      </w:r>
-      <w:r>
-        <w:t xml:space="preserve">page 47</w:t>
-      </w:r>
-      <w:r>
-        <w:t xml:space="preserve">”</w:t>
-      </w:r>
-      <w:r>
-        <w:t xml:space="preserve"> </w:t>
-      </w:r>
-      <w:r>
-        <w:t xml:space="preserve">means something different on every</w:t>
-      </w:r>
-      <w:r>
-        <w:t xml:space="preserve"> </w:t>
-      </w:r>
-      <w:r>
-        <w:t xml:space="preserve">device and at every font size a reader might choose. Two consequences follow</w:t>
-      </w:r>
-      <w:r>
-        <w:t xml:space="preserve"> </w:t>
-      </w:r>
-      <w:r>
-        <w:t xml:space="preserve">directly:</w:t>
-      </w:r>
-    </w:p>
-    <w:p>
-      <w:pPr>
-        <w:numPr>
-          <w:ilvl w:val="0"/>
-          <w:numId w:val="1008"/>
-        </w:numPr>
-        <w:pStyle w:val="Compact"/>
-      </w:pPr>
-      <w:r>
-        <w:rPr>
-          <w:bCs/>
-          <w:b/>
-        </w:rPr>
-        <w:t xml:space="preserve">Don’t build a page-numbered table of contents.</w:t>
-      </w:r>
-      <w:r>
-        <w:t xml:space="preserve"> </w:t>
-      </w:r>
-      <w:r>
-        <w:t xml:space="preserve">It cannot be accurate,</w:t>
-      </w:r>
-      <w:r>
-        <w:t xml:space="preserve"> </w:t>
-      </w:r>
-      <w:r>
-        <w:t xml:space="preserve">because there are no fixed pages to number. Kindle instead builds its own</w:t>
-      </w:r>
-      <w:r>
-        <w:t xml:space="preserve"> </w:t>
-      </w:r>
-      <w:r>
-        <w:t xml:space="preserve">“</w:t>
-      </w:r>
-      <w:r>
-        <w:t xml:space="preserve">Go To</w:t>
-      </w:r>
-      <w:r>
-        <w:t xml:space="preserve">”</w:t>
-      </w:r>
-      <w:r>
-        <w:t xml:space="preserve"> </w:t>
-      </w:r>
-      <w:r>
-        <w:t xml:space="preserve">navigation menu automatically, directly from your document’s</w:t>
-      </w:r>
-      <w:r>
-        <w:t xml:space="preserve"> </w:t>
-      </w:r>
-      <w:r>
-        <w:rPr>
-          <w:bCs/>
-          <w:b/>
-        </w:rPr>
-        <w:t xml:space="preserve">Heading 1 / Heading 2</w:t>
-      </w:r>
-      <w:r>
-        <w:t xml:space="preserve"> </w:t>
-      </w:r>
-      <w:r>
-        <w:t xml:space="preserve">paragraph styles — which is why using real</w:t>
-      </w:r>
-      <w:r>
-        <w:t xml:space="preserve"> </w:t>
-      </w:r>
-      <w:r>
-        <w:t xml:space="preserve">heading styles (not just bold, oversized text that merely</w:t>
-      </w:r>
-      <w:r>
-        <w:t xml:space="preserve"> </w:t>
-      </w:r>
-      <w:r>
-        <w:rPr>
-          <w:iCs/>
-          <w:i/>
-        </w:rPr>
-        <w:t xml:space="preserve">looks</w:t>
-      </w:r>
-      <w:r>
-        <w:t xml:space="preserve"> </w:t>
-      </w:r>
-      <w:r>
-        <w:t xml:space="preserve">like a</w:t>
-      </w:r>
-      <w:r>
-        <w:t xml:space="preserve"> </w:t>
-      </w:r>
-      <w:r>
-        <w:t xml:space="preserve">heading) is the single most important formatting choice in the whole</w:t>
-      </w:r>
-      <w:r>
-        <w:t xml:space="preserve"> </w:t>
-      </w:r>
-      <w:r>
-        <w:t xml:space="preserve">manuscript. A plain-text contents</w:t>
-      </w:r>
-      <w:r>
-        <w:t xml:space="preserve"> </w:t>
-      </w:r>
-      <w:r>
-        <w:rPr>
-          <w:iCs/>
-          <w:i/>
-        </w:rPr>
-        <w:t xml:space="preserve">listing</w:t>
-      </w:r>
-      <w:r>
-        <w:t xml:space="preserve"> </w:t>
-      </w:r>
-      <w:r>
-        <w:t xml:space="preserve">(titles only, no page numbers,</w:t>
-      </w:r>
-      <w:r>
-        <w:t xml:space="preserve"> </w:t>
-      </w:r>
-      <w:r>
-        <w:t xml:space="preserve">the way this book’s own front matter does it) is a nice reader convenience</w:t>
-      </w:r>
-      <w:r>
-        <w:t xml:space="preserve"> </w:t>
-      </w:r>
-      <w:r>
-        <w:t xml:space="preserve">on top of that, not a replacement for it.</w:t>
-      </w:r>
-    </w:p>
-    <w:p>
-      <w:pPr>
-        <w:numPr>
-          <w:ilvl w:val="0"/>
-          <w:numId w:val="1008"/>
-        </w:numPr>
-        <w:pStyle w:val="Compact"/>
-      </w:pPr>
-      <w:r>
-        <w:rPr>
-          <w:bCs/>
-          <w:b/>
-        </w:rPr>
-        <w:t xml:space="preserve">Skip the index.</w:t>
-      </w:r>
-      <w:r>
-        <w:t xml:space="preserve"> </w:t>
-      </w:r>
-      <w:r>
-        <w:t xml:space="preserve">A print index maps terms to page numbers; without</w:t>
-      </w:r>
-      <w:r>
-        <w:t xml:space="preserve"> </w:t>
-      </w:r>
-      <w:r>
-        <w:t xml:space="preserve">fixed pages, that mapping is meaningless. If a reference title needs a</w:t>
-      </w:r>
-      <w:r>
-        <w:t xml:space="preserve"> </w:t>
-      </w:r>
-      <w:r>
-        <w:t xml:space="preserve">true, searchable index, that’s a signal to route it through print rather</w:t>
-      </w:r>
-      <w:r>
-        <w:t xml:space="preserve"> </w:t>
-      </w:r>
-      <w:r>
-        <w:t xml:space="preserve">than positioning it as a Kindle-only reference work.</w:t>
-      </w:r>
-    </w:p>
-    <w:p>
-      <w:pPr>
-        <w:pStyle w:val="FirstParagraph"/>
-      </w:pPr>
-      <w:r>
-        <w:t xml:space="preserve">Beyond headings, keep ebook formatting deliberately plain: standard paragraph</w:t>
-      </w:r>
-      <w:r>
-        <w:t xml:space="preserve"> </w:t>
-      </w:r>
-      <w:r>
-        <w:t xml:space="preserve">styles, images sized to look correct at typical device widths rather than at</w:t>
-      </w:r>
-      <w:r>
-        <w:t xml:space="preserve"> </w:t>
-      </w:r>
-      <w:r>
-        <w:t xml:space="preserve">one specific screen size, and no fixed-width text boxes or multi-column</w:t>
-      </w:r>
-      <w:r>
-        <w:t xml:space="preserve"> </w:t>
-      </w:r>
-      <w:r>
-        <w:t xml:space="preserve">layouts, which most reflowable Kindle formats handle poorly.</w:t>
-      </w:r>
-      <w:r>
-        <w:t xml:space="preserve"> </w:t>
-      </w:r>
-      <w:r>
-        <w:rPr>
-          <w:bCs/>
-          <w:b/>
-        </w:rPr>
-        <w:t xml:space="preserve">Kindle</w:t>
-      </w:r>
-      <w:r>
-        <w:rPr>
-          <w:bCs/>
-          <w:b/>
-        </w:rPr>
-        <w:t xml:space="preserve"> </w:t>
-      </w:r>
-      <w:r>
-        <w:rPr>
-          <w:bCs/>
-          <w:b/>
-        </w:rPr>
-        <w:t xml:space="preserve">Create</w:t>
-      </w:r>
-      <w:r>
-        <w:t xml:space="preserve"> </w:t>
-      </w:r>
-      <w:r>
-        <w:t xml:space="preserve">(Amazon’s free formatting tool) or a clean Word document with</w:t>
-      </w:r>
-      <w:r>
-        <w:t xml:space="preserve"> </w:t>
-      </w:r>
-      <w:r>
-        <w:t xml:space="preserve">correctly applied heading styles both get you there; what matters is the</w:t>
-      </w:r>
-      <w:r>
-        <w:t xml:space="preserve"> </w:t>
-      </w:r>
-      <w:r>
-        <w:t xml:space="preserve">underlying structure, not which tool produced it. Before you publish, use</w:t>
-      </w:r>
-      <w:r>
-        <w:t xml:space="preserve"> </w:t>
-      </w:r>
-      <w:r>
-        <w:t xml:space="preserve">KDP’s own</w:t>
-      </w:r>
-      <w:r>
-        <w:t xml:space="preserve"> </w:t>
-      </w:r>
-      <w:r>
-        <w:rPr>
-          <w:bCs/>
-          <w:b/>
-        </w:rPr>
-        <w:t xml:space="preserve">online previewer</w:t>
-      </w:r>
-      <w:r>
-        <w:t xml:space="preserve"> </w:t>
-      </w:r>
-      <w:r>
-        <w:t xml:space="preserve">and check the book on more than one simulated</w:t>
-      </w:r>
-      <w:r>
-        <w:t xml:space="preserve"> </w:t>
-      </w:r>
-      <w:r>
-        <w:t xml:space="preserve">device size — a layout that looks fine on a tablet-width preview can crowd</w:t>
-      </w:r>
-      <w:r>
-        <w:t xml:space="preserve"> </w:t>
-      </w:r>
-      <w:r>
-        <w:t xml:space="preserve">an image awkwardly on a phone-width one.</w:t>
-      </w:r>
-    </w:p>
-    <w:bookmarkEnd w:id="43"/>
-    <w:bookmarkStart w:id="47" w:name="print-everything-the-ebook-didnt-need"/>
-    <w:p>
-      <w:pPr>
-        <w:pStyle w:val="Heading3"/>
-      </w:pPr>
-      <w:r>
-        <w:t xml:space="preserve">Print: everything the ebook didn’t need</w:t>
-      </w:r>
-    </w:p>
-    <w:p>
-      <w:pPr>
-        <w:pStyle w:val="FirstParagraph"/>
-      </w:pPr>
-      <w:r>
-        <w:t xml:space="preserve">A paperback or hardcover interior needs the things the ebook explicitly</w:t>
-      </w:r>
-      <w:r>
-        <w:t xml:space="preserve"> </w:t>
-      </w:r>
-      <w:r>
-        <w:t xml:space="preserve">skipped, plus a few of its own:</w:t>
-      </w:r>
-    </w:p>
-    <w:p>
-      <w:pPr>
-        <w:numPr>
-          <w:ilvl w:val="0"/>
-          <w:numId w:val="1009"/>
-        </w:numPr>
-        <w:pStyle w:val="Compact"/>
-      </w:pPr>
-      <w:r>
-        <w:rPr>
-          <w:bCs/>
-          <w:b/>
-        </w:rPr>
-        <w:t xml:space="preserve">A real, page-numbered table of contents</w:t>
-      </w:r>
-      <w:r>
-        <w:t xml:space="preserve"> </w:t>
-      </w:r>
-      <w:r>
-        <w:t xml:space="preserve">— because print pages are</w:t>
-      </w:r>
-      <w:r>
-        <w:t xml:space="preserve"> </w:t>
-      </w:r>
-      <w:r>
-        <w:t xml:space="preserve">fixed, this one actually works, and readers expect it.</w:t>
-      </w:r>
-    </w:p>
-    <w:p>
-      <w:pPr>
-        <w:numPr>
-          <w:ilvl w:val="0"/>
-          <w:numId w:val="1009"/>
-        </w:numPr>
-        <w:pStyle w:val="Compact"/>
-      </w:pPr>
-      <w:r>
-        <w:rPr>
-          <w:bCs/>
-          <w:b/>
-        </w:rPr>
-        <w:t xml:space="preserve">Page numbers and (usually) running headers</w:t>
-      </w:r>
-      <w:r>
-        <w:t xml:space="preserve">, placed and styled</w:t>
-      </w:r>
-      <w:r>
-        <w:t xml:space="preserve"> </w:t>
-      </w:r>
-      <w:r>
-        <w:t xml:space="preserve">consistently throughout.</w:t>
-      </w:r>
-    </w:p>
-    <w:p>
-      <w:pPr>
-        <w:numPr>
-          <w:ilvl w:val="0"/>
-          <w:numId w:val="1009"/>
-        </w:numPr>
-        <w:pStyle w:val="Compact"/>
-      </w:pPr>
-      <w:r>
-        <w:rPr>
-          <w:bCs/>
-          <w:b/>
-        </w:rPr>
-        <w:t xml:space="preserve">Front matter in the conventional order</w:t>
-      </w:r>
-      <w:r>
-        <w:t xml:space="preserve">: title page, copyright page,</w:t>
-      </w:r>
-      <w:r>
-        <w:t xml:space="preserve"> </w:t>
-      </w:r>
-      <w:r>
-        <w:t xml:space="preserve">optional dedication, table of contents, then the body — readers of print</w:t>
-      </w:r>
-      <w:r>
-        <w:t xml:space="preserve"> </w:t>
-      </w:r>
-      <w:r>
-        <w:t xml:space="preserve">nonfiction expect this shape, and deviating from it reads as amateur even</w:t>
-      </w:r>
-      <w:r>
-        <w:t xml:space="preserve"> </w:t>
-      </w:r>
-      <w:r>
-        <w:t xml:space="preserve">when nothing is technically wrong.</w:t>
-      </w:r>
-    </w:p>
-    <w:p>
-      <w:pPr>
-        <w:numPr>
-          <w:ilvl w:val="0"/>
-          <w:numId w:val="1009"/>
-        </w:numPr>
-        <w:pStyle w:val="Compact"/>
-      </w:pPr>
-      <w:r>
-        <w:rPr>
-          <w:bCs/>
-          <w:b/>
-        </w:rPr>
-        <w:t xml:space="preserve">A trim size choice.</w:t>
-      </w:r>
-      <w:r>
-        <w:t xml:space="preserve"> </w:t>
-      </w:r>
-      <w:r>
-        <w:t xml:space="preserve">6”×9” is the most common choice for nonfiction —</w:t>
-      </w:r>
-      <w:r>
-        <w:t xml:space="preserve"> </w:t>
-      </w:r>
-      <w:r>
-        <w:t xml:space="preserve">large enough to keep line lengths comfortable, small enough to print</w:t>
-      </w:r>
-      <w:r>
-        <w:t xml:space="preserve"> </w:t>
-      </w:r>
-      <w:r>
-        <w:t xml:space="preserve">economically — with 5.5”×8.5” a common alternative for shorter, more</w:t>
-      </w:r>
-      <w:r>
-        <w:t xml:space="preserve"> </w:t>
-      </w:r>
-      <w:r>
-        <w:t xml:space="preserve">portable guides.</w:t>
-      </w:r>
-    </w:p>
-    <w:p>
-      <w:pPr>
-        <w:numPr>
-          <w:ilvl w:val="0"/>
-          <w:numId w:val="1009"/>
-        </w:numPr>
-        <w:pStyle w:val="Compact"/>
-      </w:pPr>
-      <w:r>
-        <w:rPr>
-          <w:bCs/>
-          <w:b/>
-        </w:rPr>
-        <w:t xml:space="preserve">Margins that account for the gutter</w:t>
-      </w:r>
-      <w:r>
-        <w:t xml:space="preserve"> </w:t>
-      </w:r>
-      <w:r>
-        <w:t xml:space="preserve">— the inner margin needs extra</w:t>
-      </w:r>
-      <w:r>
-        <w:t xml:space="preserve"> </w:t>
-      </w:r>
-      <w:r>
-        <w:t xml:space="preserve">room so text isn’t swallowed by the binding, especially as page count</w:t>
-      </w:r>
-      <w:r>
-        <w:t xml:space="preserve"> </w:t>
-      </w:r>
-      <w:r>
-        <w:t xml:space="preserve">grows.</w:t>
-      </w:r>
-    </w:p>
-    <w:p>
-      <w:pPr>
-        <w:numPr>
-          <w:ilvl w:val="0"/>
-          <w:numId w:val="1009"/>
-        </w:numPr>
-        <w:pStyle w:val="Compact"/>
-      </w:pPr>
-      <w:r>
-        <w:rPr>
-          <w:bCs/>
-          <w:b/>
-        </w:rPr>
-        <w:t xml:space="preserve">Bleed, only if something touches the page edge.</w:t>
-      </w:r>
-      <w:r>
-        <w:t xml:space="preserve"> </w:t>
-      </w:r>
-      <w:r>
-        <w:t xml:space="preserve">A book with no</w:t>
-      </w:r>
-      <w:r>
-        <w:t xml:space="preserve"> </w:t>
-      </w:r>
-      <w:r>
-        <w:t xml:space="preserve">full-bleed images or background color doesn’t need a bleed margin at all;</w:t>
-      </w:r>
-      <w:r>
-        <w:t xml:space="preserve"> </w:t>
-      </w:r>
-      <w:r>
-        <w:t xml:space="preserve">add one only for pages that actually require it.</w:t>
-      </w:r>
-    </w:p>
-    <w:p>
-      <w:pPr>
-        <w:numPr>
-          <w:ilvl w:val="0"/>
-          <w:numId w:val="1009"/>
-        </w:numPr>
-        <w:pStyle w:val="Compact"/>
-      </w:pPr>
-      <w:r>
-        <w:rPr>
-          <w:bCs/>
-          <w:b/>
-        </w:rPr>
-        <w:t xml:space="preserve">Spine width and cover dimensions calculated by KDP’s own cover</w:t>
-      </w:r>
-      <w:r>
-        <w:rPr>
-          <w:bCs/>
-          <w:b/>
-        </w:rPr>
-        <w:t xml:space="preserve"> </w:t>
-      </w:r>
-      <w:r>
-        <w:rPr>
-          <w:bCs/>
-          <w:b/>
-        </w:rPr>
-        <w:t xml:space="preserve">template tool</w:t>
-      </w:r>
-      <w:r>
-        <w:t xml:space="preserve">, not by hand. Spine width depends on exact page count,</w:t>
-      </w:r>
-      <w:r>
-        <w:t xml:space="preserve"> </w:t>
-      </w:r>
-      <w:r>
-        <w:t xml:space="preserve">trim size, paper color (white vs. cream), and interior ink (black-and-white</w:t>
-      </w:r>
-      <w:r>
-        <w:t xml:space="preserve"> </w:t>
-      </w:r>
-      <w:r>
-        <w:t xml:space="preserve">vs. color) — four variables that make hand-calculating it a good way to</w:t>
-      </w:r>
-      <w:r>
-        <w:t xml:space="preserve"> </w:t>
-      </w:r>
-      <w:r>
-        <w:t xml:space="preserve">order a cover that doesn’t fit.</w:t>
-      </w:r>
-    </w:p>
-    <w:p>
-      <w:pPr>
-        <w:numPr>
-          <w:ilvl w:val="0"/>
-          <w:numId w:val="1009"/>
-        </w:numPr>
-        <w:pStyle w:val="Compact"/>
-      </w:pPr>
-      <w:r>
-        <w:rPr>
-          <w:bCs/>
-          <w:b/>
-        </w:rPr>
-        <w:t xml:space="preserve">A physical proof, ordered and actually read, before you hit publish.</w:t>
-      </w:r>
-      <w:r>
-        <w:t xml:space="preserve"> </w:t>
-      </w:r>
-      <w:r>
-        <w:t xml:space="preserve">Screen previews miss things — color that renders differently in print, a</w:t>
-      </w:r>
-      <w:r>
-        <w:t xml:space="preserve"> </w:t>
-      </w:r>
-      <w:r>
-        <w:t xml:space="preserve">margin that looked fine on screen but crowds the gutter, a font substitution</w:t>
-      </w:r>
-      <w:r>
-        <w:t xml:space="preserve"> </w:t>
-      </w:r>
-      <w:r>
-        <w:t xml:space="preserve">— that only show up in your hands.</w:t>
-      </w:r>
-    </w:p>
-    <w:p>
-      <w:pPr>
         <w:pStyle w:val="FigureCaption"/>
       </w:pPr>
       <w:r>
         <w:drawing>
           <wp:inline>
-            <wp:extent cx="4013200" cy="3186237"/>
+            <wp:extent cx="4013200" cy="4822122"/>
             <wp:effectExtent b="0" l="0" r="0" t="0"/>
-            <wp:docPr descr="" title="" id="45" name="Picture"/>
+            <wp:docPr descr="" title="" id="43" name="Picture"/>
             <a:graphic>
               <a:graphicData uri="http://schemas.openxmlformats.org/drawingml/2006/picture">
                 <pic:pic>
                   <pic:nvPicPr>
-                    <pic:cNvPr descr="figures/fig05_ebook_vs_print.png" id="46" name="Picture"/>
+                    <pic:cNvPr descr="figures/fig04_editing_workflow.png" id="44" name="Picture"/>
                     <pic:cNvPicPr>
                       <a:picLocks noChangeArrowheads="1" noChangeAspect="1"/>
                     </pic:cNvPicPr>
                   </pic:nvPicPr>
                   <pic:blipFill>
-                    <a:blip r:embed="rId44"/>
+                    <a:blip r:embed="rId42"/>
                     <a:stretch>
                       <a:fillRect/>
                     </a:stretch>
@@ -5038,7 +3794,7 @@
                   <pic:spPr bwMode="auto">
                     <a:xfrm>
                       <a:off x="0" y="0"/>
-                      <a:ext cx="4013200" cy="3186237"/>
+                      <a:ext cx="4013200" cy="4822122"/>
                     </a:xfrm>
                     <a:prstGeom prst="rect">
                       <a:avLst/>
@@ -5066,83 +3822,1525 @@
           <w:bCs/>
           <w:b/>
         </w:rPr>
-        <w:t xml:space="preserve">Figure 5.1</w:t>
-      </w:r>
-      <w:r>
-        <w:t xml:space="preserve"> </w:t>
-      </w:r>
-      <w:r>
-        <w:t xml:space="preserve">— What each format needs and what it doesn’t. Building both</w:t>
-      </w:r>
-      <w:r>
-        <w:t xml:space="preserve"> </w:t>
-      </w:r>
-      <w:r>
-        <w:t xml:space="preserve">from one file works only if you’re deliberate about which list applies to</w:t>
-      </w:r>
-      <w:r>
-        <w:t xml:space="preserve"> </w:t>
-      </w:r>
-      <w:r>
-        <w:t xml:space="preserve">which output.</w:t>
-      </w:r>
-    </w:p>
-    <w:p>
-      <w:pPr>
-        <w:pStyle w:val="KeyTakeaway"/>
+        <w:t xml:space="preserve">Figure 4.1</w:t>
+      </w:r>
+      <w:r>
+        <w:t xml:space="preserve"> </w:t>
+      </w:r>
+      <w:r>
+        <w:t xml:space="preserve">— Four genuinely different passes, run in order, ending in a</w:t>
+      </w:r>
+      <w:r>
+        <w:t xml:space="preserve"> </w:t>
+      </w:r>
+      <w:r>
+        <w:t xml:space="preserve">manuscript that’s actually ready for Chapter 5 — not four names for the</w:t>
+      </w:r>
+      <w:r>
+        <w:t xml:space="preserve"> </w:t>
+      </w:r>
+      <w:r>
+        <w:t xml:space="preserve">same read-through.</w:t>
+      </w:r>
+    </w:p>
+    <w:p>
+      <w:pPr>
+        <w:pStyle w:val="CaseStudy"/>
       </w:pPr>
       <w:r>
         <w:rPr>
           <w:bCs/>
           <w:b/>
         </w:rPr>
-        <w:t xml:space="preserve">Key takeaway:</w:t>
-      </w:r>
-      <w:r>
-        <w:t xml:space="preserve"> </w:t>
-      </w:r>
-      <w:r>
-        <w:t xml:space="preserve">Format for the reader’s actual device, not for how the</w:t>
-      </w:r>
-      <w:r>
-        <w:t xml:space="preserve"> </w:t>
-      </w:r>
-      <w:r>
-        <w:t xml:space="preserve">manuscript looks in your word processor. An ebook formatted like a Word</w:t>
-      </w:r>
-      <w:r>
-        <w:t xml:space="preserve"> </w:t>
-      </w:r>
-      <w:r>
-        <w:t xml:space="preserve">printout (fixed page-number references, a dead table of contents) looks</w:t>
-      </w:r>
-      <w:r>
-        <w:t xml:space="preserve"> </w:t>
-      </w:r>
-      <w:r>
-        <w:t xml:space="preserve">broken to a Kindle reader; a paperback formatted like a webpage (no page</w:t>
-      </w:r>
-      <w:r>
-        <w:t xml:space="preserve"> </w:t>
-      </w:r>
-      <w:r>
-        <w:t xml:space="preserve">numbers, no running headers) looks unfinished to a print reader. Same words,</w:t>
-      </w:r>
-      <w:r>
-        <w:t xml:space="preserve"> </w:t>
-      </w:r>
-      <w:r>
-        <w:t xml:space="preserve">two different finished products.</w:t>
+        <w:t xml:space="preserve">Case study: what</w:t>
+      </w:r>
+      <w:r>
+        <w:rPr>
+          <w:bCs/>
+          <w:b/>
+        </w:rPr>
+        <w:t xml:space="preserve"> </w:t>
+      </w:r>
+      <w:r>
+        <w:rPr>
+          <w:bCs/>
+          <w:b/>
+        </w:rPr>
+        <w:t xml:space="preserve">“</w:t>
+      </w:r>
+      <w:r>
+        <w:rPr>
+          <w:bCs/>
+          <w:b/>
+        </w:rPr>
+        <w:t xml:space="preserve">professional-grade</w:t>
+      </w:r>
+      <w:r>
+        <w:rPr>
+          <w:bCs/>
+          <w:b/>
+        </w:rPr>
+        <w:t xml:space="preserve">”</w:t>
+      </w:r>
+      <w:r>
+        <w:rPr>
+          <w:bCs/>
+          <w:b/>
+        </w:rPr>
+        <w:t xml:space="preserve"> </w:t>
+      </w:r>
+      <w:r>
+        <w:rPr>
+          <w:bCs/>
+          <w:b/>
+        </w:rPr>
+        <w:t xml:space="preserve">editing actually looks like in</w:t>
+      </w:r>
+      <w:r>
+        <w:rPr>
+          <w:bCs/>
+          <w:b/>
+        </w:rPr>
+        <w:t xml:space="preserve"> </w:t>
+      </w:r>
+      <w:r>
+        <w:rPr>
+          <w:bCs/>
+          <w:b/>
+        </w:rPr>
+        <w:t xml:space="preserve">practice.</w:t>
+      </w:r>
+      <w:r>
+        <w:t xml:space="preserve"> </w:t>
+      </w:r>
+      <w:r>
+        <w:t xml:space="preserve">Elsewhere in this same catalog, a 38-chapter technical book went</w:t>
+      </w:r>
+      <w:r>
+        <w:t xml:space="preserve"> </w:t>
+      </w:r>
+      <w:r>
+        <w:t xml:space="preserve">through</w:t>
+      </w:r>
+      <w:r>
+        <w:t xml:space="preserve"> </w:t>
+      </w:r>
+      <w:r>
+        <w:rPr>
+          <w:iCs/>
+          <w:i/>
+        </w:rPr>
+        <w:t xml:space="preserve">three separate independent review passes</w:t>
+      </w:r>
+      <w:r>
+        <w:t xml:space="preserve"> </w:t>
+      </w:r>
+      <w:r>
+        <w:t xml:space="preserve">after its first</w:t>
+      </w:r>
+      <w:r>
+        <w:t xml:space="preserve"> </w:t>
+      </w:r>
+      <w:r>
+        <w:t xml:space="preserve">“</w:t>
+      </w:r>
+      <w:r>
+        <w:t xml:space="preserve">complete</w:t>
+      </w:r>
+      <w:r>
+        <w:t xml:space="preserve">”</w:t>
+      </w:r>
+      <w:r>
+        <w:t xml:space="preserve"> </w:t>
+      </w:r>
+      <w:r>
+        <w:t xml:space="preserve">draft — each one specifically briefed to hunt for what the</w:t>
+      </w:r>
+      <w:r>
+        <w:t xml:space="preserve"> </w:t>
+      </w:r>
+      <w:r>
+        <w:t xml:space="preserve">previous pass missed rather than re-check settled items, each one</w:t>
+      </w:r>
+      <w:r>
+        <w:t xml:space="preserve"> </w:t>
+      </w:r>
+      <w:r>
+        <w:t xml:space="preserve">independently re-deriving every worked numerical example from scratch rather</w:t>
+      </w:r>
+      <w:r>
+        <w:t xml:space="preserve"> </w:t>
+      </w:r>
+      <w:r>
+        <w:t xml:space="preserve">than trusting the displayed answer. The three passes together found and fixed</w:t>
+      </w:r>
+      <w:r>
+        <w:t xml:space="preserve"> </w:t>
+      </w:r>
+      <w:r>
+        <w:t xml:space="preserve">13, then 21, then 18 confirmed issues — genuine arithmetic errors, a physics</w:t>
+      </w:r>
+      <w:r>
+        <w:t xml:space="preserve"> </w:t>
+      </w:r>
+      <w:r>
+        <w:t xml:space="preserve">claim that quietly contradicted the book’s own formula two paragraphs</w:t>
+      </w:r>
+      <w:r>
+        <w:t xml:space="preserve"> </w:t>
+      </w:r>
+      <w:r>
+        <w:t xml:space="preserve">earlier, cross-references pointing at the wrong chapter after a renumbering,</w:t>
+      </w:r>
+      <w:r>
+        <w:t xml:space="preserve"> </w:t>
+      </w:r>
+      <w:r>
+        <w:t xml:space="preserve">and (twice) a fix from an</w:t>
+      </w:r>
+      <w:r>
+        <w:t xml:space="preserve"> </w:t>
+      </w:r>
+      <w:r>
+        <w:rPr>
+          <w:iCs/>
+          <w:i/>
+        </w:rPr>
+        <w:t xml:space="preserve">earlier</w:t>
+      </w:r>
+      <w:r>
+        <w:t xml:space="preserve"> </w:t>
+      </w:r>
+      <w:r>
+        <w:t xml:space="preserve">pass that had itself introduced a new,</w:t>
+      </w:r>
+      <w:r>
+        <w:t xml:space="preserve"> </w:t>
+      </w:r>
+      <w:r>
+        <w:t xml:space="preserve">smaller inconsistency. A companion book in the same catalog ran a dedicated</w:t>
+      </w:r>
+      <w:r>
+        <w:t xml:space="preserve"> </w:t>
+      </w:r>
+      <w:r>
+        <w:t xml:space="preserve">mechanical sweep for overused qualifier words —</w:t>
+      </w:r>
+      <w:r>
+        <w:t xml:space="preserve"> </w:t>
+      </w:r>
+      <w:r>
+        <w:t xml:space="preserve">“</w:t>
+      </w:r>
+      <w:r>
+        <w:t xml:space="preserve">roughly,</w:t>
+      </w:r>
+      <w:r>
+        <w:t xml:space="preserve">”</w:t>
+      </w:r>
+      <w:r>
+        <w:t xml:space="preserve"> </w:t>
+      </w:r>
+      <w:r>
+        <w:t xml:space="preserve">“</w:t>
+      </w:r>
+      <w:r>
+        <w:t xml:space="preserve">essentially,</w:t>
+      </w:r>
+      <w:r>
+        <w:t xml:space="preserve">”</w:t>
+      </w:r>
+      <w:r>
+        <w:t xml:space="preserve"> </w:t>
+      </w:r>
+      <w:r>
+        <w:t xml:space="preserve">“</w:t>
+      </w:r>
+      <w:r>
+        <w:t xml:space="preserve">itself</w:t>
+      </w:r>
+      <w:r>
+        <w:t xml:space="preserve">”</w:t>
+      </w:r>
+      <w:r>
+        <w:t xml:space="preserve"> </w:t>
+      </w:r>
+      <w:r>
+        <w:t xml:space="preserve">— appearing twice on the same page, catching 111 instances a normal</w:t>
+      </w:r>
+      <w:r>
+        <w:t xml:space="preserve"> </w:t>
+      </w:r>
+      <w:r>
+        <w:t xml:space="preserve">read-through had sailed past every time, because a reader’s eye and a</w:t>
+      </w:r>
+      <w:r>
+        <w:t xml:space="preserve"> </w:t>
+      </w:r>
+      <w:r>
+        <w:t xml:space="preserve">targeted script are looking for different things. The lesson isn’t</w:t>
+      </w:r>
+      <w:r>
+        <w:t xml:space="preserve"> </w:t>
+      </w:r>
+      <w:r>
+        <w:t xml:space="preserve">“</w:t>
+      </w:r>
+      <w:r>
+        <w:t xml:space="preserve">hire</w:t>
+      </w:r>
+      <w:r>
+        <w:t xml:space="preserve"> </w:t>
+      </w:r>
+      <w:r>
+        <w:t xml:space="preserve">three editors</w:t>
+      </w:r>
+      <w:r>
+        <w:t xml:space="preserve">”</w:t>
+      </w:r>
+      <w:r>
+        <w:t xml:space="preserve"> </w:t>
+      </w:r>
+      <w:r>
+        <w:t xml:space="preserve">if your budget doesn’t allow it — it’s that</w:t>
+      </w:r>
+      <w:r>
+        <w:t xml:space="preserve"> </w:t>
+      </w:r>
+      <w:r>
+        <w:rPr>
+          <w:bCs/>
+          <w:b/>
+        </w:rPr>
+        <w:t xml:space="preserve">the errors</w:t>
+      </w:r>
+      <w:r>
+        <w:rPr>
+          <w:bCs/>
+          <w:b/>
+        </w:rPr>
+        <w:t xml:space="preserve"> </w:t>
+      </w:r>
+      <w:r>
+        <w:rPr>
+          <w:bCs/>
+          <w:b/>
+        </w:rPr>
+        <w:t xml:space="preserve">still in your manuscript after one careful read are, almost by definition,</w:t>
+      </w:r>
+      <w:r>
+        <w:rPr>
+          <w:bCs/>
+          <w:b/>
+        </w:rPr>
+        <w:t xml:space="preserve"> </w:t>
+      </w:r>
+      <w:r>
+        <w:rPr>
+          <w:bCs/>
+          <w:b/>
+        </w:rPr>
+        <w:t xml:space="preserve">the ones a normal read doesn’t catch.</w:t>
+      </w:r>
+      <w:r>
+        <w:t xml:space="preserve"> </w:t>
+      </w:r>
+      <w:r>
+        <w:t xml:space="preserve">Budget at least one pass that is</w:t>
+      </w:r>
+      <w:r>
+        <w:t xml:space="preserve"> </w:t>
+      </w:r>
+      <w:r>
+        <w:t xml:space="preserve">specifically</w:t>
+      </w:r>
+      <w:r>
+        <w:t xml:space="preserve"> </w:t>
+      </w:r>
+      <w:r>
+        <w:rPr>
+          <w:iCs/>
+          <w:i/>
+        </w:rPr>
+        <w:t xml:space="preserve">not</w:t>
+      </w:r>
+      <w:r>
+        <w:t xml:space="preserve"> </w:t>
+      </w:r>
+      <w:r>
+        <w:t xml:space="preserve">just reading the book again: a fact-check pass, a</w:t>
+      </w:r>
+      <w:r>
+        <w:t xml:space="preserve"> </w:t>
+      </w:r>
+      <w:r>
+        <w:t xml:space="preserve">consistency script, a reader who has never seen the manuscript before.</w:t>
+      </w:r>
+    </w:p>
+    <w:bookmarkEnd w:id="45"/>
+    <w:bookmarkStart w:id="46" w:name="X72d8730a9c8c3129ddaea5a55d3df5a49b8a18c"/>
+    <w:p>
+      <w:pPr>
+        <w:pStyle w:val="Heading3"/>
+      </w:pPr>
+      <w:r>
+        <w:t xml:space="preserve">Where AI genuinely helps, and where the line is</w:t>
+      </w:r>
+    </w:p>
+    <w:p>
+      <w:pPr>
+        <w:pStyle w:val="FirstParagraph"/>
+      </w:pPr>
+      <w:r>
+        <w:t xml:space="preserve">Used well, AI tools can speed up the unglamorous parts of this process: a</w:t>
+      </w:r>
+      <w:r>
+        <w:t xml:space="preserve"> </w:t>
+      </w:r>
+      <w:r>
+        <w:t xml:space="preserve">first-pass consistency check across hundreds of pages, generating several</w:t>
+      </w:r>
+      <w:r>
+        <w:t xml:space="preserve"> </w:t>
+      </w:r>
+      <w:r>
+        <w:t xml:space="preserve">alternative phrasings of an awkward paragraph for you to choose between and</w:t>
+      </w:r>
+      <w:r>
+        <w:t xml:space="preserve"> </w:t>
+      </w:r>
+      <w:r>
+        <w:t xml:space="preserve">rewrite, condensing research notes, or catching a subset of the kind of</w:t>
+      </w:r>
+      <w:r>
+        <w:t xml:space="preserve"> </w:t>
+      </w:r>
+      <w:r>
+        <w:t xml:space="preserve">mechanical errors described above. Used badly, it becomes the entire book —</w:t>
+      </w:r>
+      <w:r>
+        <w:t xml:space="preserve"> </w:t>
+      </w:r>
+      <w:r>
+        <w:t xml:space="preserve">a prompt, minimal human review, and a KDP upload — and readers have gotten</w:t>
+      </w:r>
+      <w:r>
+        <w:t xml:space="preserve"> </w:t>
+      </w:r>
+      <w:r>
+        <w:t xml:space="preserve">noticeably better at spotting the tell-tale flatness of that approach, which</w:t>
+      </w:r>
+      <w:r>
+        <w:t xml:space="preserve"> </w:t>
+      </w:r>
+      <w:r>
+        <w:t xml:space="preserve">shows up in review sections as a specific and damaging complaint.</w:t>
+      </w:r>
+    </w:p>
+    <w:p>
+      <w:pPr>
+        <w:pStyle w:val="BodyText"/>
+      </w:pPr>
+      <w:r>
+        <w:t xml:space="preserve">Two things are not optional, regardless of how much AI assistance you use in</w:t>
+      </w:r>
+      <w:r>
+        <w:t xml:space="preserve"> </w:t>
+      </w:r>
+      <w:r>
+        <w:t xml:space="preserve">your process:</w:t>
+      </w:r>
+    </w:p>
+    <w:p>
+      <w:pPr>
+        <w:numPr>
+          <w:ilvl w:val="0"/>
+          <w:numId w:val="1006"/>
+        </w:numPr>
+        <w:pStyle w:val="Compact"/>
+      </w:pPr>
+      <w:r>
+        <w:rPr>
+          <w:bCs/>
+          <w:b/>
+        </w:rPr>
+        <w:t xml:space="preserve">Amazon requires disclosure.</w:t>
+      </w:r>
+      <w:r>
+        <w:t xml:space="preserve"> </w:t>
+      </w:r>
+      <w:r>
+        <w:t xml:space="preserve">KDP’s publishing questionnaire asks you to</w:t>
+      </w:r>
+      <w:r>
+        <w:t xml:space="preserve"> </w:t>
+      </w:r>
+      <w:r>
+        <w:t xml:space="preserve">declare whether a title contains AI-generated text, images, or</w:t>
+      </w:r>
+      <w:r>
+        <w:t xml:space="preserve"> </w:t>
+      </w:r>
+      <w:r>
+        <w:t xml:space="preserve">translation, and misrepresenting that is a content-policy violation, not a</w:t>
+      </w:r>
+      <w:r>
+        <w:t xml:space="preserve"> </w:t>
+      </w:r>
+      <w:r>
+        <w:t xml:space="preserve">gray area. Answer it honestly.</w:t>
+      </w:r>
+    </w:p>
+    <w:p>
+      <w:pPr>
+        <w:numPr>
+          <w:ilvl w:val="0"/>
+          <w:numId w:val="1006"/>
+        </w:numPr>
+        <w:pStyle w:val="Compact"/>
+      </w:pPr>
+      <w:r>
+        <w:rPr>
+          <w:bCs/>
+          <w:b/>
+        </w:rPr>
+        <w:t xml:space="preserve">A human has to be the last editorial judgment.</w:t>
+      </w:r>
+      <w:r>
+        <w:t xml:space="preserve"> </w:t>
+      </w:r>
+      <w:r>
+        <w:t xml:space="preserve">Whatever tools condense,</w:t>
+      </w:r>
+      <w:r>
+        <w:t xml:space="preserve"> </w:t>
+      </w:r>
+      <w:r>
+        <w:t xml:space="preserve">draft, or suggest, the decision that a sentence is accurate, that an</w:t>
+      </w:r>
+      <w:r>
+        <w:t xml:space="preserve"> </w:t>
+      </w:r>
+      <w:r>
+        <w:t xml:space="preserve">example is correct, and that a chapter says what you actually mean has to</w:t>
+      </w:r>
+      <w:r>
+        <w:t xml:space="preserve"> </w:t>
+      </w:r>
+      <w:r>
+        <w:t xml:space="preserve">be made by a person who is accountable for it — which in practice means</w:t>
+      </w:r>
+      <w:r>
+        <w:t xml:space="preserve"> </w:t>
+      </w:r>
+      <w:r>
+        <w:t xml:space="preserve">the fact-check and consistency passes above are not optional just because</w:t>
+      </w:r>
+      <w:r>
+        <w:t xml:space="preserve"> </w:t>
+      </w:r>
+      <w:r>
+        <w:t xml:space="preserve">a tool helped write the first draft.</w:t>
+      </w:r>
+    </w:p>
+    <w:bookmarkEnd w:id="46"/>
+    <w:bookmarkStart w:id="47" w:name="a-minimum-revision-checklist"/>
+    <w:p>
+      <w:pPr>
+        <w:pStyle w:val="Heading3"/>
+      </w:pPr>
+      <w:r>
+        <w:t xml:space="preserve">A minimum revision checklist</w:t>
+      </w:r>
+    </w:p>
+    <w:p>
+      <w:pPr>
+        <w:pStyle w:val="FirstParagraph"/>
+      </w:pPr>
+      <w:r>
+        <w:t xml:space="preserve">If you do nothing else before publishing, do these:</w:t>
+      </w:r>
+    </w:p>
+    <w:p>
+      <w:pPr>
+        <w:numPr>
+          <w:ilvl w:val="0"/>
+          <w:numId w:val="1007"/>
+        </w:numPr>
+        <w:pStyle w:val="Compact"/>
+      </w:pPr>
+      <w:r>
+        <w:rPr>
+          <w:bCs/>
+          <w:b/>
+        </w:rPr>
+        <w:t xml:space="preserve">Read it aloud, or have text-to-speech read it to you.</w:t>
+      </w:r>
+      <w:r>
+        <w:t xml:space="preserve"> </w:t>
+      </w:r>
+      <w:r>
+        <w:t xml:space="preserve">Your ear catches</w:t>
+      </w:r>
+      <w:r>
+        <w:t xml:space="preserve"> </w:t>
+      </w:r>
+      <w:r>
+        <w:t xml:space="preserve">rhythm problems and repeated words your eye slides past.</w:t>
+      </w:r>
+    </w:p>
+    <w:p>
+      <w:pPr>
+        <w:numPr>
+          <w:ilvl w:val="0"/>
+          <w:numId w:val="1007"/>
+        </w:numPr>
+        <w:pStyle w:val="Compact"/>
+      </w:pPr>
+      <w:r>
+        <w:rPr>
+          <w:bCs/>
+          <w:b/>
+        </w:rPr>
+        <w:t xml:space="preserve">Check every number and every cross-reference.</w:t>
+      </w:r>
+      <w:r>
+        <w:t xml:space="preserve"> </w:t>
+      </w:r>
+      <w:r>
+        <w:t xml:space="preserve">“</w:t>
+      </w:r>
+      <w:r>
+        <w:t xml:space="preserve">As shown in Chapter 4</w:t>
+      </w:r>
+      <w:r>
+        <w:t xml:space="preserve">”</w:t>
+      </w:r>
+      <w:r>
+        <w:t xml:space="preserve"> </w:t>
+      </w:r>
+      <w:r>
+        <w:t xml:space="preserve">needs to actually be Chapter 4, still, after every reorganization.</w:t>
+      </w:r>
+    </w:p>
+    <w:p>
+      <w:pPr>
+        <w:numPr>
+          <w:ilvl w:val="0"/>
+          <w:numId w:val="1007"/>
+        </w:numPr>
+        <w:pStyle w:val="Compact"/>
+      </w:pPr>
+      <w:r>
+        <w:rPr>
+          <w:bCs/>
+          <w:b/>
+        </w:rPr>
+        <w:t xml:space="preserve">Run one adversarial pass.</w:t>
+      </w:r>
+      <w:r>
+        <w:t xml:space="preserve"> </w:t>
+      </w:r>
+      <w:r>
+        <w:t xml:space="preserve">Read it once specifically looking for ways</w:t>
+      </w:r>
+      <w:r>
+        <w:t xml:space="preserve"> </w:t>
+      </w:r>
+      <w:r>
+        <w:t xml:space="preserve">to be wrong — a claim you can’t actually back up, a promise the book</w:t>
+      </w:r>
+      <w:r>
+        <w:t xml:space="preserve"> </w:t>
+      </w:r>
+      <w:r>
+        <w:t xml:space="preserve">doesn’t deliver on, a contradiction between an early chapter and a later</w:t>
+      </w:r>
+      <w:r>
+        <w:t xml:space="preserve"> </w:t>
+      </w:r>
+      <w:r>
+        <w:t xml:space="preserve">one.</w:t>
+      </w:r>
+    </w:p>
+    <w:p>
+      <w:pPr>
+        <w:numPr>
+          <w:ilvl w:val="0"/>
+          <w:numId w:val="1007"/>
+        </w:numPr>
+        <w:pStyle w:val="Compact"/>
+      </w:pPr>
+      <w:r>
+        <w:rPr>
+          <w:bCs/>
+          <w:b/>
+        </w:rPr>
+        <w:t xml:space="preserve">Get at least one outside reader</w:t>
+      </w:r>
+      <w:r>
+        <w:t xml:space="preserve"> </w:t>
+      </w:r>
+      <w:r>
+        <w:t xml:space="preserve">who has never seen the manuscript</w:t>
+      </w:r>
+      <w:r>
+        <w:t xml:space="preserve"> </w:t>
+      </w:r>
+      <w:r>
+        <w:t xml:space="preserve">before, and ask them specifically where they got confused or bored, not</w:t>
+      </w:r>
+      <w:r>
+        <w:t xml:space="preserve"> </w:t>
+      </w:r>
+      <w:r>
+        <w:t xml:space="preserve">just whether they</w:t>
+      </w:r>
+      <w:r>
+        <w:t xml:space="preserve"> </w:t>
+      </w:r>
+      <w:r>
+        <w:t xml:space="preserve">“</w:t>
+      </w:r>
+      <w:r>
+        <w:t xml:space="preserve">liked it.</w:t>
+      </w:r>
+      <w:r>
+        <w:t xml:space="preserve">”</w:t>
       </w:r>
     </w:p>
     <w:bookmarkEnd w:id="47"/>
     <w:bookmarkEnd w:id="48"/>
-    <w:bookmarkStart w:id="56" w:name="X7393335c740f488c082861b9b1d0ccaf9a90b6c"/>
+    <w:bookmarkStart w:id="54" w:name="Xc7622a188585e28435401aff35a225d1040f6f2"/>
     <w:p>
       <w:pPr>
         <w:pStyle w:val="Heading2"/>
       </w:pPr>
       <w:r>
+        <w:t xml:space="preserve">Chapter 5: Formatting That Doesn’t Break Kindle</w:t>
+      </w:r>
+    </w:p>
+    <w:p>
+      <w:pPr>
+        <w:pStyle w:val="FirstParagraph"/>
+      </w:pPr>
+      <w:r>
+        <w:t xml:space="preserve">Ebook formatting and print formatting are not the same job wearing two hats —</w:t>
+      </w:r>
+      <w:r>
+        <w:t xml:space="preserve"> </w:t>
+      </w:r>
+      <w:r>
+        <w:t xml:space="preserve">they solve different problems, and treating one file as automatically</w:t>
+      </w:r>
+      <w:r>
+        <w:t xml:space="preserve"> </w:t>
+      </w:r>
+      <w:r>
+        <w:t xml:space="preserve">correct for both formats is where a lot of self-published books develop</w:t>
+      </w:r>
+      <w:r>
+        <w:t xml:space="preserve"> </w:t>
+      </w:r>
+      <w:r>
+        <w:t xml:space="preserve">avoidable, embarrassing bugs (a page-number reference in a book with no</w:t>
+      </w:r>
+      <w:r>
+        <w:t xml:space="preserve"> </w:t>
+      </w:r>
+      <w:r>
+        <w:t xml:space="preserve">fixed pages, a table of contents with no working links, a paperback with no</w:t>
+      </w:r>
+      <w:r>
+        <w:t xml:space="preserve"> </w:t>
+      </w:r>
+      <w:r>
+        <w:t xml:space="preserve">page numbers at all).</w:t>
+      </w:r>
+    </w:p>
+    <w:bookmarkStart w:id="49" w:name="ebooks-let-kindle-do-the-navigation"/>
+    <w:p>
+      <w:pPr>
+        <w:pStyle w:val="Heading3"/>
+      </w:pPr>
+      <w:r>
+        <w:t xml:space="preserve">Ebooks: let Kindle do the navigation</w:t>
+      </w:r>
+    </w:p>
+    <w:p>
+      <w:pPr>
+        <w:pStyle w:val="FirstParagraph"/>
+      </w:pPr>
+      <w:r>
+        <w:t xml:space="preserve">A Kindle reader can change font size, font, and line spacing, which means</w:t>
+      </w:r>
+      <w:r>
+        <w:t xml:space="preserve"> </w:t>
+      </w:r>
+      <w:r>
+        <w:t xml:space="preserve">your ebook has no fixed pages —</w:t>
+      </w:r>
+      <w:r>
+        <w:t xml:space="preserve"> </w:t>
+      </w:r>
+      <w:r>
+        <w:t xml:space="preserve">“</w:t>
+      </w:r>
+      <w:r>
+        <w:t xml:space="preserve">page 47</w:t>
+      </w:r>
+      <w:r>
+        <w:t xml:space="preserve">”</w:t>
+      </w:r>
+      <w:r>
+        <w:t xml:space="preserve"> </w:t>
+      </w:r>
+      <w:r>
+        <w:t xml:space="preserve">means something different on every</w:t>
+      </w:r>
+      <w:r>
+        <w:t xml:space="preserve"> </w:t>
+      </w:r>
+      <w:r>
+        <w:t xml:space="preserve">device and at every font size a reader might choose. Two consequences follow</w:t>
+      </w:r>
+      <w:r>
+        <w:t xml:space="preserve"> </w:t>
+      </w:r>
+      <w:r>
+        <w:t xml:space="preserve">directly:</w:t>
+      </w:r>
+    </w:p>
+    <w:p>
+      <w:pPr>
+        <w:numPr>
+          <w:ilvl w:val="0"/>
+          <w:numId w:val="1008"/>
+        </w:numPr>
+        <w:pStyle w:val="Compact"/>
+      </w:pPr>
+      <w:r>
+        <w:rPr>
+          <w:bCs/>
+          <w:b/>
+        </w:rPr>
+        <w:t xml:space="preserve">Don’t build a page-numbered table of contents.</w:t>
+      </w:r>
+      <w:r>
+        <w:t xml:space="preserve"> </w:t>
+      </w:r>
+      <w:r>
+        <w:t xml:space="preserve">It cannot be accurate,</w:t>
+      </w:r>
+      <w:r>
+        <w:t xml:space="preserve"> </w:t>
+      </w:r>
+      <w:r>
+        <w:t xml:space="preserve">because there are no fixed pages to number. Kindle instead builds its own</w:t>
+      </w:r>
+      <w:r>
+        <w:t xml:space="preserve"> </w:t>
+      </w:r>
+      <w:r>
+        <w:t xml:space="preserve">“</w:t>
+      </w:r>
+      <w:r>
+        <w:t xml:space="preserve">Go To</w:t>
+      </w:r>
+      <w:r>
+        <w:t xml:space="preserve">”</w:t>
+      </w:r>
+      <w:r>
+        <w:t xml:space="preserve"> </w:t>
+      </w:r>
+      <w:r>
+        <w:t xml:space="preserve">navigation menu automatically, directly from your document’s</w:t>
+      </w:r>
+      <w:r>
+        <w:t xml:space="preserve"> </w:t>
+      </w:r>
+      <w:r>
+        <w:rPr>
+          <w:bCs/>
+          <w:b/>
+        </w:rPr>
+        <w:t xml:space="preserve">Heading 1 / Heading 2</w:t>
+      </w:r>
+      <w:r>
+        <w:t xml:space="preserve"> </w:t>
+      </w:r>
+      <w:r>
+        <w:t xml:space="preserve">paragraph styles — which is why using real</w:t>
+      </w:r>
+      <w:r>
+        <w:t xml:space="preserve"> </w:t>
+      </w:r>
+      <w:r>
+        <w:t xml:space="preserve">heading styles (not just bold, oversized text that merely</w:t>
+      </w:r>
+      <w:r>
+        <w:t xml:space="preserve"> </w:t>
+      </w:r>
+      <w:r>
+        <w:rPr>
+          <w:iCs/>
+          <w:i/>
+        </w:rPr>
+        <w:t xml:space="preserve">looks</w:t>
+      </w:r>
+      <w:r>
+        <w:t xml:space="preserve"> </w:t>
+      </w:r>
+      <w:r>
+        <w:t xml:space="preserve">like a</w:t>
+      </w:r>
+      <w:r>
+        <w:t xml:space="preserve"> </w:t>
+      </w:r>
+      <w:r>
+        <w:t xml:space="preserve">heading) is the single most important formatting choice in the whole</w:t>
+      </w:r>
+      <w:r>
+        <w:t xml:space="preserve"> </w:t>
+      </w:r>
+      <w:r>
+        <w:t xml:space="preserve">manuscript. A plain-text contents</w:t>
+      </w:r>
+      <w:r>
+        <w:t xml:space="preserve"> </w:t>
+      </w:r>
+      <w:r>
+        <w:rPr>
+          <w:iCs/>
+          <w:i/>
+        </w:rPr>
+        <w:t xml:space="preserve">listing</w:t>
+      </w:r>
+      <w:r>
+        <w:t xml:space="preserve"> </w:t>
+      </w:r>
+      <w:r>
+        <w:t xml:space="preserve">(titles only, no page numbers,</w:t>
+      </w:r>
+      <w:r>
+        <w:t xml:space="preserve"> </w:t>
+      </w:r>
+      <w:r>
+        <w:t xml:space="preserve">the way this book’s own front matter does it) is a nice reader convenience</w:t>
+      </w:r>
+      <w:r>
+        <w:t xml:space="preserve"> </w:t>
+      </w:r>
+      <w:r>
+        <w:t xml:space="preserve">on top of that, not a replacement for it.</w:t>
+      </w:r>
+    </w:p>
+    <w:p>
+      <w:pPr>
+        <w:numPr>
+          <w:ilvl w:val="0"/>
+          <w:numId w:val="1008"/>
+        </w:numPr>
+        <w:pStyle w:val="Compact"/>
+      </w:pPr>
+      <w:r>
+        <w:rPr>
+          <w:bCs/>
+          <w:b/>
+        </w:rPr>
+        <w:t xml:space="preserve">Skip the index.</w:t>
+      </w:r>
+      <w:r>
+        <w:t xml:space="preserve"> </w:t>
+      </w:r>
+      <w:r>
+        <w:t xml:space="preserve">A print index maps terms to page numbers; without</w:t>
+      </w:r>
+      <w:r>
+        <w:t xml:space="preserve"> </w:t>
+      </w:r>
+      <w:r>
+        <w:t xml:space="preserve">fixed pages, that mapping is meaningless. If a reference title needs a</w:t>
+      </w:r>
+      <w:r>
+        <w:t xml:space="preserve"> </w:t>
+      </w:r>
+      <w:r>
+        <w:t xml:space="preserve">true, searchable index, that’s a signal to route it through print rather</w:t>
+      </w:r>
+      <w:r>
+        <w:t xml:space="preserve"> </w:t>
+      </w:r>
+      <w:r>
+        <w:t xml:space="preserve">than positioning it as a Kindle-only reference work.</w:t>
+      </w:r>
+    </w:p>
+    <w:p>
+      <w:pPr>
+        <w:pStyle w:val="FirstParagraph"/>
+      </w:pPr>
+      <w:r>
+        <w:t xml:space="preserve">Beyond headings, keep ebook formatting deliberately plain: standard paragraph</w:t>
+      </w:r>
+      <w:r>
+        <w:t xml:space="preserve"> </w:t>
+      </w:r>
+      <w:r>
+        <w:t xml:space="preserve">styles, images sized to look correct at typical device widths rather than at</w:t>
+      </w:r>
+      <w:r>
+        <w:t xml:space="preserve"> </w:t>
+      </w:r>
+      <w:r>
+        <w:t xml:space="preserve">one specific screen size, and no fixed-width text boxes or multi-column</w:t>
+      </w:r>
+      <w:r>
+        <w:t xml:space="preserve"> </w:t>
+      </w:r>
+      <w:r>
+        <w:t xml:space="preserve">layouts, which most reflowable Kindle formats handle poorly.</w:t>
+      </w:r>
+      <w:r>
+        <w:t xml:space="preserve"> </w:t>
+      </w:r>
+      <w:r>
+        <w:rPr>
+          <w:bCs/>
+          <w:b/>
+        </w:rPr>
+        <w:t xml:space="preserve">Kindle</w:t>
+      </w:r>
+      <w:r>
+        <w:rPr>
+          <w:bCs/>
+          <w:b/>
+        </w:rPr>
+        <w:t xml:space="preserve"> </w:t>
+      </w:r>
+      <w:r>
+        <w:rPr>
+          <w:bCs/>
+          <w:b/>
+        </w:rPr>
+        <w:t xml:space="preserve">Create</w:t>
+      </w:r>
+      <w:r>
+        <w:t xml:space="preserve"> </w:t>
+      </w:r>
+      <w:r>
+        <w:t xml:space="preserve">(Amazon’s free formatting tool) or a clean Word document with</w:t>
+      </w:r>
+      <w:r>
+        <w:t xml:space="preserve"> </w:t>
+      </w:r>
+      <w:r>
+        <w:t xml:space="preserve">correctly applied heading styles both get you there; what matters is the</w:t>
+      </w:r>
+      <w:r>
+        <w:t xml:space="preserve"> </w:t>
+      </w:r>
+      <w:r>
+        <w:t xml:space="preserve">underlying structure, not which tool produced it. Before you publish, use</w:t>
+      </w:r>
+      <w:r>
+        <w:t xml:space="preserve"> </w:t>
+      </w:r>
+      <w:r>
+        <w:t xml:space="preserve">KDP’s own</w:t>
+      </w:r>
+      <w:r>
+        <w:t xml:space="preserve"> </w:t>
+      </w:r>
+      <w:r>
+        <w:rPr>
+          <w:bCs/>
+          <w:b/>
+        </w:rPr>
+        <w:t xml:space="preserve">online previewer</w:t>
+      </w:r>
+      <w:r>
+        <w:t xml:space="preserve"> </w:t>
+      </w:r>
+      <w:r>
+        <w:t xml:space="preserve">and check the book on more than one simulated</w:t>
+      </w:r>
+      <w:r>
+        <w:t xml:space="preserve"> </w:t>
+      </w:r>
+      <w:r>
+        <w:t xml:space="preserve">device size — a layout that looks fine on a tablet-width preview can crowd</w:t>
+      </w:r>
+      <w:r>
+        <w:t xml:space="preserve"> </w:t>
+      </w:r>
+      <w:r>
+        <w:t xml:space="preserve">an image awkwardly on a phone-width one.</w:t>
+      </w:r>
+    </w:p>
+    <w:bookmarkEnd w:id="49"/>
+    <w:bookmarkStart w:id="53" w:name="print-everything-the-ebook-didnt-need"/>
+    <w:p>
+      <w:pPr>
+        <w:pStyle w:val="Heading3"/>
+      </w:pPr>
+      <w:r>
+        <w:t xml:space="preserve">Print: everything the ebook didn’t need</w:t>
+      </w:r>
+    </w:p>
+    <w:p>
+      <w:pPr>
+        <w:pStyle w:val="FirstParagraph"/>
+      </w:pPr>
+      <w:r>
+        <w:t xml:space="preserve">A paperback or hardcover interior needs the things the ebook explicitly</w:t>
+      </w:r>
+      <w:r>
+        <w:t xml:space="preserve"> </w:t>
+      </w:r>
+      <w:r>
+        <w:t xml:space="preserve">skipped, plus a few of its own:</w:t>
+      </w:r>
+    </w:p>
+    <w:p>
+      <w:pPr>
+        <w:numPr>
+          <w:ilvl w:val="0"/>
+          <w:numId w:val="1009"/>
+        </w:numPr>
+        <w:pStyle w:val="Compact"/>
+      </w:pPr>
+      <w:r>
+        <w:rPr>
+          <w:bCs/>
+          <w:b/>
+        </w:rPr>
+        <w:t xml:space="preserve">A real, page-numbered table of contents</w:t>
+      </w:r>
+      <w:r>
+        <w:t xml:space="preserve"> </w:t>
+      </w:r>
+      <w:r>
+        <w:t xml:space="preserve">— because print pages are</w:t>
+      </w:r>
+      <w:r>
+        <w:t xml:space="preserve"> </w:t>
+      </w:r>
+      <w:r>
+        <w:t xml:space="preserve">fixed, this one actually works, and readers expect it.</w:t>
+      </w:r>
+    </w:p>
+    <w:p>
+      <w:pPr>
+        <w:numPr>
+          <w:ilvl w:val="0"/>
+          <w:numId w:val="1009"/>
+        </w:numPr>
+        <w:pStyle w:val="Compact"/>
+      </w:pPr>
+      <w:r>
+        <w:rPr>
+          <w:bCs/>
+          <w:b/>
+        </w:rPr>
+        <w:t xml:space="preserve">Page numbers and (usually) running headers</w:t>
+      </w:r>
+      <w:r>
+        <w:t xml:space="preserve">, placed and styled</w:t>
+      </w:r>
+      <w:r>
+        <w:t xml:space="preserve"> </w:t>
+      </w:r>
+      <w:r>
+        <w:t xml:space="preserve">consistently throughout.</w:t>
+      </w:r>
+    </w:p>
+    <w:p>
+      <w:pPr>
+        <w:numPr>
+          <w:ilvl w:val="0"/>
+          <w:numId w:val="1009"/>
+        </w:numPr>
+        <w:pStyle w:val="Compact"/>
+      </w:pPr>
+      <w:r>
+        <w:rPr>
+          <w:bCs/>
+          <w:b/>
+        </w:rPr>
+        <w:t xml:space="preserve">Front matter in the conventional order</w:t>
+      </w:r>
+      <w:r>
+        <w:t xml:space="preserve">: title page, copyright page,</w:t>
+      </w:r>
+      <w:r>
+        <w:t xml:space="preserve"> </w:t>
+      </w:r>
+      <w:r>
+        <w:t xml:space="preserve">optional dedication, table of contents, then the body — readers of print</w:t>
+      </w:r>
+      <w:r>
+        <w:t xml:space="preserve"> </w:t>
+      </w:r>
+      <w:r>
+        <w:t xml:space="preserve">nonfiction expect this shape, and deviating from it reads as amateur even</w:t>
+      </w:r>
+      <w:r>
+        <w:t xml:space="preserve"> </w:t>
+      </w:r>
+      <w:r>
+        <w:t xml:space="preserve">when nothing is technically wrong.</w:t>
+      </w:r>
+    </w:p>
+    <w:p>
+      <w:pPr>
+        <w:numPr>
+          <w:ilvl w:val="0"/>
+          <w:numId w:val="1009"/>
+        </w:numPr>
+        <w:pStyle w:val="Compact"/>
+      </w:pPr>
+      <w:r>
+        <w:rPr>
+          <w:bCs/>
+          <w:b/>
+        </w:rPr>
+        <w:t xml:space="preserve">A trim size choice.</w:t>
+      </w:r>
+      <w:r>
+        <w:t xml:space="preserve"> </w:t>
+      </w:r>
+      <w:r>
+        <w:t xml:space="preserve">6”×9” is the most common choice for nonfiction —</w:t>
+      </w:r>
+      <w:r>
+        <w:t xml:space="preserve"> </w:t>
+      </w:r>
+      <w:r>
+        <w:t xml:space="preserve">large enough to keep line lengths comfortable, small enough to print</w:t>
+      </w:r>
+      <w:r>
+        <w:t xml:space="preserve"> </w:t>
+      </w:r>
+      <w:r>
+        <w:t xml:space="preserve">economically — with 5.5”×8.5” a common alternative for shorter, more</w:t>
+      </w:r>
+      <w:r>
+        <w:t xml:space="preserve"> </w:t>
+      </w:r>
+      <w:r>
+        <w:t xml:space="preserve">portable guides.</w:t>
+      </w:r>
+    </w:p>
+    <w:p>
+      <w:pPr>
+        <w:numPr>
+          <w:ilvl w:val="0"/>
+          <w:numId w:val="1009"/>
+        </w:numPr>
+        <w:pStyle w:val="Compact"/>
+      </w:pPr>
+      <w:r>
+        <w:rPr>
+          <w:bCs/>
+          <w:b/>
+        </w:rPr>
+        <w:t xml:space="preserve">Margins that account for the gutter</w:t>
+      </w:r>
+      <w:r>
+        <w:t xml:space="preserve"> </w:t>
+      </w:r>
+      <w:r>
+        <w:t xml:space="preserve">— the inner margin needs extra</w:t>
+      </w:r>
+      <w:r>
+        <w:t xml:space="preserve"> </w:t>
+      </w:r>
+      <w:r>
+        <w:t xml:space="preserve">room so text isn’t swallowed by the binding, especially as page count</w:t>
+      </w:r>
+      <w:r>
+        <w:t xml:space="preserve"> </w:t>
+      </w:r>
+      <w:r>
+        <w:t xml:space="preserve">grows.</w:t>
+      </w:r>
+    </w:p>
+    <w:p>
+      <w:pPr>
+        <w:numPr>
+          <w:ilvl w:val="0"/>
+          <w:numId w:val="1009"/>
+        </w:numPr>
+        <w:pStyle w:val="Compact"/>
+      </w:pPr>
+      <w:r>
+        <w:rPr>
+          <w:bCs/>
+          <w:b/>
+        </w:rPr>
+        <w:t xml:space="preserve">Bleed, only if something touches the page edge.</w:t>
+      </w:r>
+      <w:r>
+        <w:t xml:space="preserve"> </w:t>
+      </w:r>
+      <w:r>
+        <w:t xml:space="preserve">A book with no</w:t>
+      </w:r>
+      <w:r>
+        <w:t xml:space="preserve"> </w:t>
+      </w:r>
+      <w:r>
+        <w:t xml:space="preserve">full-bleed images or background color doesn’t need a bleed margin at all;</w:t>
+      </w:r>
+      <w:r>
+        <w:t xml:space="preserve"> </w:t>
+      </w:r>
+      <w:r>
+        <w:t xml:space="preserve">add one only for pages that actually require it.</w:t>
+      </w:r>
+    </w:p>
+    <w:p>
+      <w:pPr>
+        <w:numPr>
+          <w:ilvl w:val="0"/>
+          <w:numId w:val="1009"/>
+        </w:numPr>
+        <w:pStyle w:val="Compact"/>
+      </w:pPr>
+      <w:r>
+        <w:rPr>
+          <w:bCs/>
+          <w:b/>
+        </w:rPr>
+        <w:t xml:space="preserve">Spine width and cover dimensions calculated by KDP’s own cover</w:t>
+      </w:r>
+      <w:r>
+        <w:rPr>
+          <w:bCs/>
+          <w:b/>
+        </w:rPr>
+        <w:t xml:space="preserve"> </w:t>
+      </w:r>
+      <w:r>
+        <w:rPr>
+          <w:bCs/>
+          <w:b/>
+        </w:rPr>
+        <w:t xml:space="preserve">template tool</w:t>
+      </w:r>
+      <w:r>
+        <w:t xml:space="preserve">, not by hand. Spine width depends on exact page count,</w:t>
+      </w:r>
+      <w:r>
+        <w:t xml:space="preserve"> </w:t>
+      </w:r>
+      <w:r>
+        <w:t xml:space="preserve">trim size, paper color (white vs. cream), and interior ink (black-and-white</w:t>
+      </w:r>
+      <w:r>
+        <w:t xml:space="preserve"> </w:t>
+      </w:r>
+      <w:r>
+        <w:t xml:space="preserve">vs. color) — four variables that make hand-calculating it a good way to</w:t>
+      </w:r>
+      <w:r>
+        <w:t xml:space="preserve"> </w:t>
+      </w:r>
+      <w:r>
+        <w:t xml:space="preserve">order a cover that doesn’t fit.</w:t>
+      </w:r>
+    </w:p>
+    <w:p>
+      <w:pPr>
+        <w:numPr>
+          <w:ilvl w:val="0"/>
+          <w:numId w:val="1009"/>
+        </w:numPr>
+        <w:pStyle w:val="Compact"/>
+      </w:pPr>
+      <w:r>
+        <w:rPr>
+          <w:bCs/>
+          <w:b/>
+        </w:rPr>
+        <w:t xml:space="preserve">A physical proof, ordered and actually read, before you hit publish.</w:t>
+      </w:r>
+      <w:r>
+        <w:t xml:space="preserve"> </w:t>
+      </w:r>
+      <w:r>
+        <w:t xml:space="preserve">Screen previews miss things — color that renders differently in print, a</w:t>
+      </w:r>
+      <w:r>
+        <w:t xml:space="preserve"> </w:t>
+      </w:r>
+      <w:r>
+        <w:t xml:space="preserve">margin that looked fine on screen but crowds the gutter, a font substitution</w:t>
+      </w:r>
+      <w:r>
+        <w:t xml:space="preserve"> </w:t>
+      </w:r>
+      <w:r>
+        <w:t xml:space="preserve">— that only show up in your hands.</w:t>
+      </w:r>
+    </w:p>
+    <w:p>
+      <w:pPr>
+        <w:pStyle w:val="FigureCaption"/>
+      </w:pPr>
+      <w:r>
+        <w:drawing>
+          <wp:inline>
+            <wp:extent cx="4013200" cy="3660524"/>
+            <wp:effectExtent b="0" l="0" r="0" t="0"/>
+            <wp:docPr descr="" title="" id="51" name="Picture"/>
+            <a:graphic>
+              <a:graphicData uri="http://schemas.openxmlformats.org/drawingml/2006/picture">
+                <pic:pic>
+                  <pic:nvPicPr>
+                    <pic:cNvPr descr="figures/fig05_ebook_vs_print.png" id="52" name="Picture"/>
+                    <pic:cNvPicPr>
+                      <a:picLocks noChangeArrowheads="1" noChangeAspect="1"/>
+                    </pic:cNvPicPr>
+                  </pic:nvPicPr>
+                  <pic:blipFill>
+                    <a:blip r:embed="rId50"/>
+                    <a:stretch>
+                      <a:fillRect/>
+                    </a:stretch>
+                  </pic:blipFill>
+                  <pic:spPr bwMode="auto">
+                    <a:xfrm>
+                      <a:off x="0" y="0"/>
+                      <a:ext cx="4013200" cy="3660524"/>
+                    </a:xfrm>
+                    <a:prstGeom prst="rect">
+                      <a:avLst/>
+                    </a:prstGeom>
+                    <a:noFill/>
+                    <a:ln w="9525">
+                      <a:noFill/>
+                      <a:headEnd/>
+                      <a:tailEnd/>
+                    </a:ln>
+                  </pic:spPr>
+                </pic:pic>
+              </a:graphicData>
+            </a:graphic>
+          </wp:inline>
+        </w:drawing>
+      </w:r>
+    </w:p>
+    <w:p>
+      <w:pPr>
+        <w:pStyle w:val="FigureCaption"/>
+      </w:pPr>
+      <w:r>
+        <w:rPr>
+          <w:bCs/>
+          <w:b/>
+        </w:rPr>
+        <w:t xml:space="preserve">Figure 5.1</w:t>
+      </w:r>
+      <w:r>
+        <w:t xml:space="preserve"> </w:t>
+      </w:r>
+      <w:r>
+        <w:t xml:space="preserve">— The same finished manuscript, two different finishing</w:t>
+      </w:r>
+      <w:r>
+        <w:t xml:space="preserve"> </w:t>
+      </w:r>
+      <w:r>
+        <w:t xml:space="preserve">workflows. They diverge immediately, and</w:t>
+      </w:r>
+      <w:r>
+        <w:t xml:space="preserve"> </w:t>
+      </w:r>
+      <w:r>
+        <w:t xml:space="preserve">“</w:t>
+      </w:r>
+      <w:r>
+        <w:t xml:space="preserve">did the ebook steps by habit on</w:t>
+      </w:r>
+      <w:r>
+        <w:t xml:space="preserve"> </w:t>
+      </w:r>
+      <w:r>
+        <w:t xml:space="preserve">the print file</w:t>
+      </w:r>
+      <w:r>
+        <w:t xml:space="preserve">”</w:t>
+      </w:r>
+      <w:r>
+        <w:t xml:space="preserve"> </w:t>
+      </w:r>
+      <w:r>
+        <w:t xml:space="preserve">(or vice versa) is exactly the kind of avoidable bug this</w:t>
+      </w:r>
+      <w:r>
+        <w:t xml:space="preserve"> </w:t>
+      </w:r>
+      <w:r>
+        <w:t xml:space="preserve">split is meant to prevent.</w:t>
+      </w:r>
+    </w:p>
+    <w:p>
+      <w:pPr>
+        <w:pStyle w:val="KeyTakeaway"/>
+      </w:pPr>
+      <w:r>
+        <w:rPr>
+          <w:bCs/>
+          <w:b/>
+        </w:rPr>
+        <w:t xml:space="preserve">Key takeaway:</w:t>
+      </w:r>
+      <w:r>
+        <w:t xml:space="preserve"> </w:t>
+      </w:r>
+      <w:r>
+        <w:t xml:space="preserve">Format for the reader’s actual device, not for how the</w:t>
+      </w:r>
+      <w:r>
+        <w:t xml:space="preserve"> </w:t>
+      </w:r>
+      <w:r>
+        <w:t xml:space="preserve">manuscript looks in your word processor. An ebook formatted like a Word</w:t>
+      </w:r>
+      <w:r>
+        <w:t xml:space="preserve"> </w:t>
+      </w:r>
+      <w:r>
+        <w:t xml:space="preserve">printout (fixed page-number references, a dead table of contents) looks</w:t>
+      </w:r>
+      <w:r>
+        <w:t xml:space="preserve"> </w:t>
+      </w:r>
+      <w:r>
+        <w:t xml:space="preserve">broken to a Kindle reader; a paperback formatted like a webpage (no page</w:t>
+      </w:r>
+      <w:r>
+        <w:t xml:space="preserve"> </w:t>
+      </w:r>
+      <w:r>
+        <w:t xml:space="preserve">numbers, no running headers) looks unfinished to a print reader. Same words,</w:t>
+      </w:r>
+      <w:r>
+        <w:t xml:space="preserve"> </w:t>
+      </w:r>
+      <w:r>
+        <w:t xml:space="preserve">two different finished products.</w:t>
+      </w:r>
+    </w:p>
+    <w:bookmarkEnd w:id="53"/>
+    <w:bookmarkEnd w:id="54"/>
+    <w:bookmarkStart w:id="62" w:name="X7393335c740f488c082861b9b1d0ccaf9a90b6c"/>
+    <w:p>
+      <w:pPr>
+        <w:pStyle w:val="Heading2"/>
+      </w:pPr>
+      <w:r>
         <w:t xml:space="preserve">Chapter 6: Covers That Sell in a Thumbnail</w:t>
       </w:r>
     </w:p>
@@ -5214,7 +5412,7 @@
         <w:t xml:space="preserve">the artwork is.</w:t>
       </w:r>
     </w:p>
-    <w:bookmarkStart w:id="52" w:name="the-thumbnail-test"/>
+    <w:bookmarkStart w:id="58" w:name="the-thumbnail-test"/>
     <w:p>
       <w:pPr>
         <w:pStyle w:val="Heading3"/>
@@ -5300,18 +5498,18 @@
           <wp:inline>
             <wp:extent cx="4013200" cy="2912610"/>
             <wp:effectExtent b="0" l="0" r="0" t="0"/>
-            <wp:docPr descr="" title="" id="50" name="Picture"/>
+            <wp:docPr descr="" title="" id="56" name="Picture"/>
             <a:graphic>
               <a:graphicData uri="http://schemas.openxmlformats.org/drawingml/2006/picture">
                 <pic:pic>
                   <pic:nvPicPr>
-                    <pic:cNvPr descr="figures/fig06_thumbnail_test.png" id="51" name="Picture"/>
+                    <pic:cNvPr descr="figures/fig06_thumbnail_test.png" id="57" name="Picture"/>
                     <pic:cNvPicPr>
                       <a:picLocks noChangeArrowheads="1" noChangeAspect="1"/>
                     </pic:cNvPicPr>
                   </pic:nvPicPr>
                   <pic:blipFill>
-                    <a:blip r:embed="rId49"/>
+                    <a:blip r:embed="rId55"/>
                     <a:stretch>
                       <a:fillRect/>
                     </a:stretch>
@@ -5374,8 +5572,8 @@
         <w:t xml:space="preserve">larger one.</w:t>
       </w:r>
     </w:p>
-    <w:bookmarkEnd w:id="52"/>
-    <w:bookmarkStart w:id="53" w:name="Xfbc52b445dbbe76034ccd208d9c8a78694bb02f"/>
+    <w:bookmarkEnd w:id="58"/>
+    <w:bookmarkStart w:id="59" w:name="Xfbc52b445dbbe76034ccd208d9c8a78694bb02f"/>
     <w:p>
       <w:pPr>
         <w:pStyle w:val="Heading3"/>
@@ -5474,8 +5672,8 @@
         <w:t xml:space="preserve">title.</w:t>
       </w:r>
     </w:p>
-    <w:bookmarkEnd w:id="53"/>
-    <w:bookmarkStart w:id="54" w:name="X3976923392f8172aad9f4cdee749317536ab754"/>
+    <w:bookmarkEnd w:id="59"/>
+    <w:bookmarkStart w:id="60" w:name="X3976923392f8172aad9f4cdee749317536ab754"/>
     <w:p>
       <w:pPr>
         <w:pStyle w:val="Heading3"/>
@@ -5573,8 +5771,8 @@
         <w:t xml:space="preserve">gives the eye nowhere obvious to start.</w:t>
       </w:r>
     </w:p>
-    <w:bookmarkEnd w:id="54"/>
-    <w:bookmarkStart w:id="55" w:name="X68541cb9df0f323e46b555a8b1fa3ce04ad6df1"/>
+    <w:bookmarkEnd w:id="60"/>
+    <w:bookmarkStart w:id="61" w:name="X68541cb9df0f323e46b555a8b1fa3ce04ad6df1"/>
     <w:p>
       <w:pPr>
         <w:pStyle w:val="Heading3"/>
@@ -5750,10 +5948,10 @@
         <w:t xml:space="preserve">entire chapter, and the one most often skipped.</w:t>
       </w:r>
     </w:p>
-    <w:bookmarkEnd w:id="55"/>
-    <w:bookmarkEnd w:id="56"/>
-    <w:bookmarkEnd w:id="57"/>
-    <w:bookmarkStart w:id="86" w:name="part-iii-getting-discovered"/>
+    <w:bookmarkEnd w:id="61"/>
+    <w:bookmarkEnd w:id="62"/>
+    <w:bookmarkEnd w:id="63"/>
+    <w:bookmarkStart w:id="95" w:name="part-iii-getting-discovered"/>
     <w:p>
       <w:pPr>
         <w:pStyle w:val="Heading1"/>
@@ -5762,7 +5960,7 @@
         <w:t xml:space="preserve">Part III — Getting Discovered</w:t>
       </w:r>
     </w:p>
-    <w:bookmarkStart w:id="63" w:name="X56243dcd9bbb4b670e18ec63c1835c986368394"/>
+    <w:bookmarkStart w:id="69" w:name="X56243dcd9bbb4b670e18ec63c1835c986368394"/>
     <w:p>
       <w:pPr>
         <w:pStyle w:val="Heading2"/>
@@ -5815,7 +6013,7 @@
         <w:t xml:space="preserve">immediately.</w:t>
       </w:r>
     </w:p>
-    <w:bookmarkStart w:id="61" w:name="the-seven-keyword-slots"/>
+    <w:bookmarkStart w:id="67" w:name="the-seven-keyword-slots"/>
     <w:p>
       <w:pPr>
         <w:pStyle w:val="Heading3"/>
@@ -6180,18 +6378,18 @@
           <wp:inline>
             <wp:extent cx="4013200" cy="3868912"/>
             <wp:effectExtent b="0" l="0" r="0" t="0"/>
-            <wp:docPr descr="" title="" id="59" name="Picture"/>
+            <wp:docPr descr="" title="" id="65" name="Picture"/>
             <a:graphic>
               <a:graphicData uri="http://schemas.openxmlformats.org/drawingml/2006/picture">
                 <pic:pic>
                   <pic:nvPicPr>
-                    <pic:cNvPr descr="figures/fig07_keyword_funnel.png" id="60" name="Picture"/>
+                    <pic:cNvPr descr="figures/fig07_keyword_funnel.png" id="66" name="Picture"/>
                     <pic:cNvPicPr>
                       <a:picLocks noChangeArrowheads="1" noChangeAspect="1"/>
                     </pic:cNvPicPr>
                   </pic:nvPicPr>
                   <pic:blipFill>
-                    <a:blip r:embed="rId58"/>
+                    <a:blip r:embed="rId64"/>
                     <a:stretch>
                       <a:fillRect/>
                     </a:stretch>
@@ -6260,8 +6458,8 @@
         <w:t xml:space="preserve">browses for.</w:t>
       </w:r>
     </w:p>
-    <w:bookmarkEnd w:id="61"/>
-    <w:bookmarkStart w:id="62" w:name="Xc6caf282e8cb20119dd4dab833725cf66370e82"/>
+    <w:bookmarkEnd w:id="67"/>
+    <w:bookmarkStart w:id="68" w:name="Xc6caf282e8cb20119dd4dab833725cf66370e82"/>
     <w:p>
       <w:pPr>
         <w:pStyle w:val="Heading3"/>
@@ -6541,9 +6739,9 @@
         <w:t xml:space="preserve">reasonable window, it costs nothing to request a better-fitting one.</w:t>
       </w:r>
     </w:p>
-    <w:bookmarkEnd w:id="62"/>
-    <w:bookmarkEnd w:id="63"/>
-    <w:bookmarkStart w:id="71" w:name="chapter-8-pricing-for-profit"/>
+    <w:bookmarkEnd w:id="68"/>
+    <w:bookmarkEnd w:id="69"/>
+    <w:bookmarkStart w:id="77" w:name="chapter-8-pricing-for-profit"/>
     <w:p>
       <w:pPr>
         <w:pStyle w:val="Heading2"/>
@@ -6620,7 +6818,7 @@
         <w:t xml:space="preserve">answers for a new nonfiction title.</w:t>
       </w:r>
     </w:p>
-    <w:bookmarkStart w:id="67" w:name="the-default-range-and-why"/>
+    <w:bookmarkStart w:id="73" w:name="the-default-range-and-why"/>
     <w:p>
       <w:pPr>
         <w:pStyle w:val="Heading3"/>
@@ -6820,18 +7018,18 @@
           <wp:inline>
             <wp:extent cx="4013200" cy="2626871"/>
             <wp:effectExtent b="0" l="0" r="0" t="0"/>
-            <wp:docPr descr="" title="" id="65" name="Picture"/>
+            <wp:docPr descr="" title="" id="71" name="Picture"/>
             <a:graphic>
               <a:graphicData uri="http://schemas.openxmlformats.org/drawingml/2006/picture">
                 <pic:pic>
                   <pic:nvPicPr>
-                    <pic:cNvPr descr="figures/fig08_pricing_sweet_spot.png" id="66" name="Picture"/>
+                    <pic:cNvPr descr="figures/fig08_pricing_sweet_spot.png" id="72" name="Picture"/>
                     <pic:cNvPicPr>
                       <a:picLocks noChangeArrowheads="1" noChangeAspect="1"/>
                     </pic:cNvPicPr>
                   </pic:nvPicPr>
                   <pic:blipFill>
-                    <a:blip r:embed="rId64"/>
+                    <a:blip r:embed="rId70"/>
                     <a:stretch>
                       <a:fillRect/>
                     </a:stretch>
@@ -6910,8 +7108,8 @@
         <w:t xml:space="preserve">lesson; the exact peak location varies by book, category, and audience.</w:t>
       </w:r>
     </w:p>
-    <w:bookmarkEnd w:id="67"/>
-    <w:bookmarkStart w:id="68" w:name="print-has-its-own-floor"/>
+    <w:bookmarkEnd w:id="73"/>
+    <w:bookmarkStart w:id="74" w:name="print-has-its-own-floor"/>
     <w:p>
       <w:pPr>
         <w:pStyle w:val="Heading3"/>
@@ -6980,8 +7178,8 @@
         <w:t xml:space="preserve">covers approximately none of the time this book has described so far.</w:t>
       </w:r>
     </w:p>
-    <w:bookmarkEnd w:id="68"/>
-    <w:bookmarkStart w:id="69" w:name="pricing-a-series-on-purpose"/>
+    <w:bookmarkEnd w:id="74"/>
+    <w:bookmarkStart w:id="75" w:name="pricing-a-series-on-purpose"/>
     <w:p>
       <w:pPr>
         <w:pStyle w:val="Heading3"/>
@@ -7101,8 +7299,8 @@
         <w:t xml:space="preserve">a lower verified price found elsewhere.</w:t>
       </w:r>
     </w:p>
-    <w:bookmarkEnd w:id="69"/>
-    <w:bookmarkStart w:id="70" w:name="discount-tools-honestly-described"/>
+    <w:bookmarkEnd w:id="75"/>
+    <w:bookmarkStart w:id="76" w:name="discount-tools-honestly-described"/>
     <w:p>
       <w:pPr>
         <w:pStyle w:val="Heading3"/>
@@ -7193,9 +7391,9 @@
         <w:t xml:space="preserve">not relying on what an older blog post describes.</w:t>
       </w:r>
     </w:p>
-    <w:bookmarkEnd w:id="70"/>
-    <w:bookmarkEnd w:id="71"/>
-    <w:bookmarkStart w:id="78" w:name="chapter-9-launching-without-an-audience"/>
+    <w:bookmarkEnd w:id="76"/>
+    <w:bookmarkEnd w:id="77"/>
+    <w:bookmarkStart w:id="84" w:name="chapter-9-launching-without-an-audience"/>
     <w:p>
       <w:pPr>
         <w:pStyle w:val="Heading2"/>
@@ -7265,7 +7463,7 @@
         <w:t xml:space="preserve">— how fast a book is moving right now — not just cumulative totals.</w:t>
       </w:r>
     </w:p>
-    <w:bookmarkStart w:id="72" w:name="Xa2cd2331ca1763a0a9730258a5f4e76659291cb"/>
+    <w:bookmarkStart w:id="78" w:name="Xa2cd2331ca1763a0a9730258a5f4e76659291cb"/>
     <w:p>
       <w:pPr>
         <w:pStyle w:val="Heading3"/>
@@ -7346,8 +7544,8 @@
         <w:t xml:space="preserve">margin before it, not right up against it.</w:t>
       </w:r>
     </w:p>
-    <w:bookmarkEnd w:id="72"/>
-    <w:bookmarkStart w:id="73" w:name="building-an-arc-team-correctly"/>
+    <w:bookmarkEnd w:id="78"/>
+    <w:bookmarkStart w:id="79" w:name="building-an-arc-team-correctly"/>
     <w:p>
       <w:pPr>
         <w:pStyle w:val="Heading3"/>
@@ -7493,8 +7691,8 @@
         <w:t xml:space="preserve">praise, and say so explicitly when you hand out review copies.</w:t>
       </w:r>
     </w:p>
-    <w:bookmarkEnd w:id="73"/>
-    <w:bookmarkStart w:id="77" w:name="X389c8d599179c911861fa3c4985db8079842bd3"/>
+    <w:bookmarkEnd w:id="79"/>
+    <w:bookmarkStart w:id="83" w:name="X389c8d599179c911861fa3c4985db8079842bd3"/>
     <w:p>
       <w:pPr>
         <w:pStyle w:val="Heading3"/>
@@ -7681,18 +7879,18 @@
           <wp:inline>
             <wp:extent cx="4013200" cy="2539070"/>
             <wp:effectExtent b="0" l="0" r="0" t="0"/>
-            <wp:docPr descr="" title="" id="75" name="Picture"/>
+            <wp:docPr descr="" title="" id="81" name="Picture"/>
             <a:graphic>
               <a:graphicData uri="http://schemas.openxmlformats.org/drawingml/2006/picture">
                 <pic:pic>
                   <pic:nvPicPr>
-                    <pic:cNvPr descr="figures/fig09_launch_concentration.png" id="76" name="Picture"/>
+                    <pic:cNvPr descr="figures/fig09_launch_concentration.png" id="82" name="Picture"/>
                     <pic:cNvPicPr>
                       <a:picLocks noChangeArrowheads="1" noChangeAspect="1"/>
                     </pic:cNvPicPr>
                   </pic:nvPicPr>
                   <pic:blipFill>
-                    <a:blip r:embed="rId74"/>
+                    <a:blip r:embed="rId80"/>
                     <a:stretch>
                       <a:fillRect/>
                     </a:stretch>
@@ -7811,9 +8009,9 @@
         <w:t xml:space="preserve">start the same day rather than staggering it in afterward.</w:t>
       </w:r>
     </w:p>
-    <w:bookmarkEnd w:id="77"/>
-    <w:bookmarkEnd w:id="78"/>
-    <w:bookmarkStart w:id="85" w:name="Xde3363154b1ca87587c62381d611a294ab124f6"/>
+    <w:bookmarkEnd w:id="83"/>
+    <w:bookmarkEnd w:id="84"/>
+    <w:bookmarkStart w:id="94" w:name="Xde3363154b1ca87587c62381d611a294ab124f6"/>
     <w:p>
       <w:pPr>
         <w:pStyle w:val="Heading2"/>
@@ -7860,7 +8058,7 @@
         <w:t xml:space="preserve">profitable at all.</w:t>
       </w:r>
     </w:p>
-    <w:bookmarkStart w:id="79" w:name="Xffc6b0632a74d7c9d202dc12685426c040d3586"/>
+    <w:bookmarkStart w:id="88" w:name="Xffc6b0632a74d7c9d202dc12685426c040d3586"/>
     <w:p>
       <w:pPr>
         <w:pStyle w:val="Heading3"/>
@@ -7978,229 +8176,6 @@
         <w:t xml:space="preserve">keywords from scratch and bidding blind.</w:t>
       </w:r>
     </w:p>
-    <w:bookmarkEnd w:id="79"/>
-    <w:bookmarkStart w:id="83" w:name="X8e62b280a5cdc7edce20a52b2db9f09fe8a7fd1"/>
-    <w:p>
-      <w:pPr>
-        <w:pStyle w:val="Heading3"/>
-      </w:pPr>
-      <w:r>
-        <w:t xml:space="preserve">The only formula that matters: break-even ACOS</w:t>
-      </w:r>
-    </w:p>
-    <w:p>
-      <w:pPr>
-        <w:pStyle w:val="FirstParagraph"/>
-      </w:pPr>
-      <w:r>
-        <w:rPr>
-          <w:bCs/>
-          <w:b/>
-        </w:rPr>
-        <w:t xml:space="preserve">ACOS</w:t>
-      </w:r>
-      <w:r>
-        <w:t xml:space="preserve"> </w:t>
-      </w:r>
-      <w:r>
-        <w:t xml:space="preserve">(Advertising Cost of Sales) is simply:</w:t>
-      </w:r>
-    </w:p>
-    <w:p>
-      <w:pPr>
-        <w:pStyle w:val="BlockText"/>
-      </w:pPr>
-      <w:r>
-        <w:rPr>
-          <w:bCs/>
-          <w:b/>
-        </w:rPr>
-        <w:t xml:space="preserve">ACOS = Ad Spend ÷ Ad-Attributed Sales × 100%</w:t>
-      </w:r>
-    </w:p>
-    <w:p>
-      <w:pPr>
-        <w:pStyle w:val="FirstParagraph"/>
-      </w:pPr>
-      <w:r>
-        <w:t xml:space="preserve">An ad is profitable exactly when its ACOS is</w:t>
-      </w:r>
-      <w:r>
-        <w:t xml:space="preserve"> </w:t>
-      </w:r>
-      <w:r>
-        <w:rPr>
-          <w:iCs/>
-          <w:i/>
-        </w:rPr>
-        <w:t xml:space="preserve">below</w:t>
-      </w:r>
-      <w:r>
-        <w:t xml:space="preserve"> </w:t>
-      </w:r>
-      <w:r>
-        <w:t xml:space="preserve">your</w:t>
-      </w:r>
-      <w:r>
-        <w:t xml:space="preserve"> </w:t>
-      </w:r>
-      <w:r>
-        <w:rPr>
-          <w:bCs/>
-          <w:b/>
-        </w:rPr>
-        <w:t xml:space="preserve">break-even</w:t>
-      </w:r>
-      <w:r>
-        <w:rPr>
-          <w:bCs/>
-          <w:b/>
-        </w:rPr>
-        <w:t xml:space="preserve"> </w:t>
-      </w:r>
-      <w:r>
-        <w:rPr>
-          <w:bCs/>
-          <w:b/>
-        </w:rPr>
-        <w:t xml:space="preserve">ACOS</w:t>
-      </w:r>
-      <w:r>
-        <w:t xml:space="preserve"> </w:t>
-      </w:r>
-      <w:r>
-        <w:t xml:space="preserve">— the percentage of a sale’s revenue that equals your actual royalty</w:t>
-      </w:r>
-      <w:r>
-        <w:t xml:space="preserve"> </w:t>
-      </w:r>
-      <w:r>
-        <w:t xml:space="preserve">margin:</w:t>
-      </w:r>
-    </w:p>
-    <w:p>
-      <w:pPr>
-        <w:pStyle w:val="BlockText"/>
-      </w:pPr>
-      <w:r>
-        <w:rPr>
-          <w:bCs/>
-          <w:b/>
-        </w:rPr>
-        <w:t xml:space="preserve">Break-even ACOS ≈ Royalty per Copy ÷ Sale Price × 100%</w:t>
-      </w:r>
-    </w:p>
-    <w:p>
-      <w:pPr>
-        <w:pStyle w:val="WorkedExample"/>
-      </w:pPr>
-      <w:r>
-        <w:rPr>
-          <w:bCs/>
-          <w:b/>
-        </w:rPr>
-        <w:t xml:space="preserve">Worked example.</w:t>
-      </w:r>
-      <w:r>
-        <w:t xml:space="preserve"> </w:t>
-      </w:r>
-      <w:r>
-        <w:t xml:space="preserve">A $4.99 ebook earning a $3.31 net royalty (Chapter 2’s</w:t>
-      </w:r>
-      <w:r>
-        <w:t xml:space="preserve"> </w:t>
-      </w:r>
-      <w:r>
-        <w:t xml:space="preserve">worked example) has a break-even ACOS of 3.31 ÷ 4.99 ≈</w:t>
-      </w:r>
-      <w:r>
-        <w:t xml:space="preserve"> </w:t>
-      </w:r>
-      <w:r>
-        <w:rPr>
-          <w:bCs/>
-          <w:b/>
-        </w:rPr>
-        <w:t xml:space="preserve">66%</w:t>
-      </w:r>
-      <w:r>
-        <w:t xml:space="preserve">. Spend $10 in</w:t>
-      </w:r>
-      <w:r>
-        <w:t xml:space="preserve"> </w:t>
-      </w:r>
-      <w:r>
-        <w:t xml:space="preserve">ads and sell three copies attributed to that spend (royalty: $9.93) and your</w:t>
-      </w:r>
-      <w:r>
-        <w:t xml:space="preserve"> </w:t>
-      </w:r>
-      <w:r>
-        <w:t xml:space="preserve">actual ACOS is 10 ÷ 9.93 ≈</w:t>
-      </w:r>
-      <w:r>
-        <w:t xml:space="preserve"> </w:t>
-      </w:r>
-      <w:r>
-        <w:rPr>
-          <w:bCs/>
-          <w:b/>
-        </w:rPr>
-        <w:t xml:space="preserve">101%</w:t>
-      </w:r>
-      <w:r>
-        <w:t xml:space="preserve"> </w:t>
-      </w:r>
-      <w:r>
-        <w:t xml:space="preserve">— losing money on the ad, even though it</w:t>
-      </w:r>
-      <w:r>
-        <w:t xml:space="preserve"> </w:t>
-      </w:r>
-      <w:r>
-        <w:t xml:space="preserve">“</w:t>
-      </w:r>
-      <w:r>
-        <w:t xml:space="preserve">worked</w:t>
-      </w:r>
-      <w:r>
-        <w:t xml:space="preserve">”</w:t>
-      </w:r>
-      <w:r>
-        <w:t xml:space="preserve"> </w:t>
-      </w:r>
-      <w:r>
-        <w:t xml:space="preserve">in the sense of generating sales. The same $10 spend producing five</w:t>
-      </w:r>
-      <w:r>
-        <w:t xml:space="preserve"> </w:t>
-      </w:r>
-      <w:r>
-        <w:t xml:space="preserve">sales (royalty: $16.55) gives an ACOS of 10 ÷ 16.55 ≈</w:t>
-      </w:r>
-      <w:r>
-        <w:t xml:space="preserve"> </w:t>
-      </w:r>
-      <w:r>
-        <w:rPr>
-          <w:bCs/>
-          <w:b/>
-        </w:rPr>
-        <w:t xml:space="preserve">60%</w:t>
-      </w:r>
-      <w:r>
-        <w:t xml:space="preserve"> </w:t>
-      </w:r>
-      <w:r>
-        <w:t xml:space="preserve">— under the</w:t>
-      </w:r>
-      <w:r>
-        <w:t xml:space="preserve"> </w:t>
-      </w:r>
-      <w:r>
-        <w:t xml:space="preserve">66% break-even line, and genuinely profitable.</w:t>
-      </w:r>
-    </w:p>
     <w:p>
       <w:pPr>
         <w:pStyle w:val="FigureCaption"/>
@@ -8208,20 +8183,320 @@
       <w:r>
         <w:drawing>
           <wp:inline>
-            <wp:extent cx="4013200" cy="2729310"/>
+            <wp:extent cx="4013200" cy="3301388"/>
             <wp:effectExtent b="0" l="0" r="0" t="0"/>
-            <wp:docPr descr="" title="" id="81" name="Picture"/>
+            <wp:docPr descr="" title="" id="86" name="Picture"/>
             <a:graphic>
               <a:graphicData uri="http://schemas.openxmlformats.org/drawingml/2006/picture">
                 <pic:pic>
                   <pic:nvPicPr>
-                    <pic:cNvPr descr="figures/fig10_acos_breakeven.png" id="82" name="Picture"/>
+                    <pic:cNvPr descr="figures/fig10b_ad_workflow.png" id="87" name="Picture"/>
                     <pic:cNvPicPr>
                       <a:picLocks noChangeArrowheads="1" noChangeAspect="1"/>
                     </pic:cNvPicPr>
                   </pic:nvPicPr>
                   <pic:blipFill>
-                    <a:blip r:embed="rId80"/>
+                    <a:blip r:embed="rId85"/>
+                    <a:stretch>
+                      <a:fillRect/>
+                    </a:stretch>
+                  </pic:blipFill>
+                  <pic:spPr bwMode="auto">
+                    <a:xfrm>
+                      <a:off x="0" y="0"/>
+                      <a:ext cx="4013200" cy="3301388"/>
+                    </a:xfrm>
+                    <a:prstGeom prst="rect">
+                      <a:avLst/>
+                    </a:prstGeom>
+                    <a:noFill/>
+                    <a:ln w="9525">
+                      <a:noFill/>
+                      <a:headEnd/>
+                      <a:tailEnd/>
+                    </a:ln>
+                  </pic:spPr>
+                </pic:pic>
+              </a:graphicData>
+            </a:graphic>
+          </wp:inline>
+        </w:drawing>
+      </w:r>
+    </w:p>
+    <w:p>
+      <w:pPr>
+        <w:pStyle w:val="FigureCaption"/>
+      </w:pPr>
+      <w:r>
+        <w:rPr>
+          <w:bCs/>
+          <w:b/>
+        </w:rPr>
+        <w:t xml:space="preserve">Figure 10.1</w:t>
+      </w:r>
+      <w:r>
+        <w:t xml:space="preserve"> </w:t>
+      </w:r>
+      <w:r>
+        <w:t xml:space="preserve">— This isn’t a one-time setup. New search terms keep</w:t>
+      </w:r>
+      <w:r>
+        <w:t xml:space="preserve"> </w:t>
+      </w:r>
+      <w:r>
+        <w:t xml:space="preserve">surfacing after the first harvest, so the loop back to the Search Term</w:t>
+      </w:r>
+      <w:r>
+        <w:t xml:space="preserve"> </w:t>
+      </w:r>
+      <w:r>
+        <w:t xml:space="preserve">Report keeps running for as long as the campaign does.</w:t>
+      </w:r>
+    </w:p>
+    <w:bookmarkEnd w:id="88"/>
+    <w:bookmarkStart w:id="92" w:name="X8e62b280a5cdc7edce20a52b2db9f09fe8a7fd1"/>
+    <w:p>
+      <w:pPr>
+        <w:pStyle w:val="Heading3"/>
+      </w:pPr>
+      <w:r>
+        <w:t xml:space="preserve">The only formula that matters: break-even ACOS</w:t>
+      </w:r>
+    </w:p>
+    <w:p>
+      <w:pPr>
+        <w:pStyle w:val="FirstParagraph"/>
+      </w:pPr>
+      <w:r>
+        <w:rPr>
+          <w:bCs/>
+          <w:b/>
+        </w:rPr>
+        <w:t xml:space="preserve">ACOS</w:t>
+      </w:r>
+      <w:r>
+        <w:t xml:space="preserve"> </w:t>
+      </w:r>
+      <w:r>
+        <w:t xml:space="preserve">(Advertising Cost of Sales) is simply:</w:t>
+      </w:r>
+    </w:p>
+    <w:p>
+      <w:pPr>
+        <w:pStyle w:val="BlockText"/>
+      </w:pPr>
+      <w:r>
+        <w:rPr>
+          <w:bCs/>
+          <w:b/>
+        </w:rPr>
+        <w:t xml:space="preserve">ACOS = Ad Spend ÷ Ad-Attributed Sales × 100%</w:t>
+      </w:r>
+    </w:p>
+    <w:p>
+      <w:pPr>
+        <w:pStyle w:val="FirstParagraph"/>
+      </w:pPr>
+      <w:r>
+        <w:t xml:space="preserve">An ad is profitable exactly when its ACOS is</w:t>
+      </w:r>
+      <w:r>
+        <w:t xml:space="preserve"> </w:t>
+      </w:r>
+      <w:r>
+        <w:rPr>
+          <w:iCs/>
+          <w:i/>
+        </w:rPr>
+        <w:t xml:space="preserve">below</w:t>
+      </w:r>
+      <w:r>
+        <w:t xml:space="preserve"> </w:t>
+      </w:r>
+      <w:r>
+        <w:t xml:space="preserve">your</w:t>
+      </w:r>
+      <w:r>
+        <w:t xml:space="preserve"> </w:t>
+      </w:r>
+      <w:r>
+        <w:rPr>
+          <w:bCs/>
+          <w:b/>
+        </w:rPr>
+        <w:t xml:space="preserve">break-even</w:t>
+      </w:r>
+      <w:r>
+        <w:rPr>
+          <w:bCs/>
+          <w:b/>
+        </w:rPr>
+        <w:t xml:space="preserve"> </w:t>
+      </w:r>
+      <w:r>
+        <w:rPr>
+          <w:bCs/>
+          <w:b/>
+        </w:rPr>
+        <w:t xml:space="preserve">ACOS</w:t>
+      </w:r>
+      <w:r>
+        <w:t xml:space="preserve"> </w:t>
+      </w:r>
+      <w:r>
+        <w:t xml:space="preserve">— the percentage of a sale’s revenue that equals your actual royalty</w:t>
+      </w:r>
+      <w:r>
+        <w:t xml:space="preserve"> </w:t>
+      </w:r>
+      <w:r>
+        <w:t xml:space="preserve">margin:</w:t>
+      </w:r>
+    </w:p>
+    <w:p>
+      <w:pPr>
+        <w:pStyle w:val="BlockText"/>
+      </w:pPr>
+      <w:r>
+        <w:rPr>
+          <w:bCs/>
+          <w:b/>
+        </w:rPr>
+        <w:t xml:space="preserve">Break-even ACOS ≈ Royalty per Copy ÷ Sale Price × 100%</w:t>
+      </w:r>
+    </w:p>
+    <w:p>
+      <w:pPr>
+        <w:pStyle w:val="WorkedExample"/>
+      </w:pPr>
+      <w:r>
+        <w:rPr>
+          <w:bCs/>
+          <w:b/>
+        </w:rPr>
+        <w:t xml:space="preserve">Worked example.</w:t>
+      </w:r>
+      <w:r>
+        <w:t xml:space="preserve"> </w:t>
+      </w:r>
+      <w:r>
+        <w:t xml:space="preserve">A $4.99 ebook earning a $3.31 net royalty (Chapter 2’s</w:t>
+      </w:r>
+      <w:r>
+        <w:t xml:space="preserve"> </w:t>
+      </w:r>
+      <w:r>
+        <w:t xml:space="preserve">worked example) has a break-even ACOS of 3.31 ÷ 4.99 ≈</w:t>
+      </w:r>
+      <w:r>
+        <w:t xml:space="preserve"> </w:t>
+      </w:r>
+      <w:r>
+        <w:rPr>
+          <w:bCs/>
+          <w:b/>
+        </w:rPr>
+        <w:t xml:space="preserve">66%</w:t>
+      </w:r>
+      <w:r>
+        <w:t xml:space="preserve">. Spend $10 in</w:t>
+      </w:r>
+      <w:r>
+        <w:t xml:space="preserve"> </w:t>
+      </w:r>
+      <w:r>
+        <w:t xml:space="preserve">ads and sell three copies attributed to that spend (royalty: $9.93) and your</w:t>
+      </w:r>
+      <w:r>
+        <w:t xml:space="preserve"> </w:t>
+      </w:r>
+      <w:r>
+        <w:t xml:space="preserve">actual ACOS is 10 ÷ 9.93 ≈</w:t>
+      </w:r>
+      <w:r>
+        <w:t xml:space="preserve"> </w:t>
+      </w:r>
+      <w:r>
+        <w:rPr>
+          <w:bCs/>
+          <w:b/>
+        </w:rPr>
+        <w:t xml:space="preserve">101%</w:t>
+      </w:r>
+      <w:r>
+        <w:t xml:space="preserve"> </w:t>
+      </w:r>
+      <w:r>
+        <w:t xml:space="preserve">— losing money on the ad, even though it</w:t>
+      </w:r>
+      <w:r>
+        <w:t xml:space="preserve"> </w:t>
+      </w:r>
+      <w:r>
+        <w:t xml:space="preserve">“</w:t>
+      </w:r>
+      <w:r>
+        <w:t xml:space="preserve">worked</w:t>
+      </w:r>
+      <w:r>
+        <w:t xml:space="preserve">”</w:t>
+      </w:r>
+      <w:r>
+        <w:t xml:space="preserve"> </w:t>
+      </w:r>
+      <w:r>
+        <w:t xml:space="preserve">in the sense of generating sales. The same $10 spend producing five</w:t>
+      </w:r>
+      <w:r>
+        <w:t xml:space="preserve"> </w:t>
+      </w:r>
+      <w:r>
+        <w:t xml:space="preserve">sales (royalty: $16.55) gives an ACOS of 10 ÷ 16.55 ≈</w:t>
+      </w:r>
+      <w:r>
+        <w:t xml:space="preserve"> </w:t>
+      </w:r>
+      <w:r>
+        <w:rPr>
+          <w:bCs/>
+          <w:b/>
+        </w:rPr>
+        <w:t xml:space="preserve">60%</w:t>
+      </w:r>
+      <w:r>
+        <w:t xml:space="preserve"> </w:t>
+      </w:r>
+      <w:r>
+        <w:t xml:space="preserve">— under the</w:t>
+      </w:r>
+      <w:r>
+        <w:t xml:space="preserve"> </w:t>
+      </w:r>
+      <w:r>
+        <w:t xml:space="preserve">66% break-even line, and genuinely profitable.</w:t>
+      </w:r>
+    </w:p>
+    <w:p>
+      <w:pPr>
+        <w:pStyle w:val="FigureCaption"/>
+      </w:pPr>
+      <w:r>
+        <w:drawing>
+          <wp:inline>
+            <wp:extent cx="4013200" cy="2729310"/>
+            <wp:effectExtent b="0" l="0" r="0" t="0"/>
+            <wp:docPr descr="" title="" id="90" name="Picture"/>
+            <a:graphic>
+              <a:graphicData uri="http://schemas.openxmlformats.org/drawingml/2006/picture">
+                <pic:pic>
+                  <pic:nvPicPr>
+                    <pic:cNvPr descr="figures/fig10_acos_breakeven.png" id="91" name="Picture"/>
+                    <pic:cNvPicPr>
+                      <a:picLocks noChangeArrowheads="1" noChangeAspect="1"/>
+                    </pic:cNvPicPr>
+                  </pic:nvPicPr>
+                  <pic:blipFill>
+                    <a:blip r:embed="rId89"/>
                     <a:stretch>
                       <a:fillRect/>
                     </a:stretch>
@@ -8257,7 +8532,7 @@
           <w:bCs/>
           <w:b/>
         </w:rPr>
-        <w:t xml:space="preserve">Figure 10.1</w:t>
+        <w:t xml:space="preserve">Figure 10.2</w:t>
       </w:r>
       <w:r>
         <w:t xml:space="preserve"> </w:t>
@@ -8364,8 +8639,8 @@
         <w:t xml:space="preserve">writing off a campaign that looks marginal on book one alone.</w:t>
       </w:r>
     </w:p>
-    <w:bookmarkEnd w:id="83"/>
-    <w:bookmarkStart w:id="84" w:name="budget-discipline-for-a-new-advertiser"/>
+    <w:bookmarkEnd w:id="92"/>
+    <w:bookmarkStart w:id="93" w:name="budget-discipline-for-a-new-advertiser"/>
     <w:p>
       <w:pPr>
         <w:pStyle w:val="Heading3"/>
@@ -8516,10 +8791,10 @@
         <w:t xml:space="preserve">small campaign’s numbers is mostly randomness, not signal.</w:t>
       </w:r>
     </w:p>
-    <w:bookmarkEnd w:id="84"/>
-    <w:bookmarkEnd w:id="85"/>
-    <w:bookmarkEnd w:id="86"/>
-    <w:bookmarkStart w:id="108" w:name="part-iv-the-business-side"/>
+    <w:bookmarkEnd w:id="93"/>
+    <w:bookmarkEnd w:id="94"/>
+    <w:bookmarkEnd w:id="95"/>
+    <w:bookmarkStart w:id="117" w:name="part-iv-the-business-side"/>
     <w:p>
       <w:pPr>
         <w:pStyle w:val="Heading1"/>
@@ -8528,7 +8803,7 @@
         <w:t xml:space="preserve">Part IV — The Business Side</w:t>
       </w:r>
     </w:p>
-    <w:bookmarkStart w:id="91" w:name="X569a6a5b94bb0868978a15d9d04c8ff1d059c83"/>
+    <w:bookmarkStart w:id="100" w:name="X569a6a5b94bb0868978a15d9d04c8ff1d059c83"/>
     <w:p>
       <w:pPr>
         <w:pStyle w:val="Heading2"/>
@@ -8569,7 +8844,7 @@
         <w:t xml:space="preserve">supposed to.</w:t>
       </w:r>
     </w:p>
-    <w:bookmarkStart w:id="87" w:name="X53a733f1fa0f98e69b6c8dd430272cadb7a2523"/>
+    <w:bookmarkStart w:id="96" w:name="X53a733f1fa0f98e69b6c8dd430272cadb7a2523"/>
     <w:p>
       <w:pPr>
         <w:pStyle w:val="Heading3"/>
@@ -8937,8 +9212,8 @@
         <w:t xml:space="preserve">— rather than discovering the delay when a payment is already held up.</w:t>
       </w:r>
     </w:p>
-    <w:bookmarkEnd w:id="87"/>
-    <w:bookmarkStart w:id="88" w:name="how-and-when-youre-actually-paid"/>
+    <w:bookmarkEnd w:id="96"/>
+    <w:bookmarkStart w:id="97" w:name="how-and-when-youre-actually-paid"/>
     <w:p>
       <w:pPr>
         <w:pStyle w:val="Heading3"/>
@@ -9040,8 +9315,8 @@
         <w:t xml:space="preserve">announcement.</w:t>
       </w:r>
     </w:p>
-    <w:bookmarkEnd w:id="88"/>
-    <w:bookmarkStart w:id="89" w:name="Xb24afdb1e516cdcb1246e20916c5fbfa51c9b43"/>
+    <w:bookmarkEnd w:id="97"/>
+    <w:bookmarkStart w:id="98" w:name="Xb24afdb1e516cdcb1246e20916c5fbfa51c9b43"/>
     <w:p>
       <w:pPr>
         <w:pStyle w:val="Heading3"/>
@@ -9212,8 +9487,8 @@
         <w:t xml:space="preserve">use for any real accounting.</w:t>
       </w:r>
     </w:p>
-    <w:bookmarkEnd w:id="89"/>
-    <w:bookmarkStart w:id="90" w:name="treat-it-like-the-business-it-is"/>
+    <w:bookmarkEnd w:id="98"/>
+    <w:bookmarkStart w:id="99" w:name="treat-it-like-the-business-it-is"/>
     <w:p>
       <w:pPr>
         <w:pStyle w:val="Heading3"/>
@@ -9326,9 +9601,9 @@
         <w:t xml:space="preserve">a guess from a general-purpose guide like this one.</w:t>
       </w:r>
     </w:p>
-    <w:bookmarkEnd w:id="90"/>
-    <w:bookmarkEnd w:id="91"/>
-    <w:bookmarkStart w:id="98" w:name="chapter-12-kdp-select-vs.-going-wide"/>
+    <w:bookmarkEnd w:id="99"/>
+    <w:bookmarkEnd w:id="100"/>
+    <w:bookmarkStart w:id="107" w:name="chapter-12-kdp-select-vs.-going-wide"/>
     <w:p>
       <w:pPr>
         <w:pStyle w:val="Heading2"/>
@@ -9369,7 +9644,7 @@
         <w:t xml:space="preserve">specific readers.</w:t>
       </w:r>
     </w:p>
-    <w:bookmarkStart w:id="92" w:name="X9a2790796af4b7b05f5f31f640b3ff9bf4b47ce"/>
+    <w:bookmarkStart w:id="101" w:name="X9a2790796af4b7b05f5f31f640b3ff9bf4b47ce"/>
     <w:p>
       <w:pPr>
         <w:pStyle w:val="Heading3"/>
@@ -9548,8 +9823,8 @@
         <w:t xml:space="preserve">forgetting the renewal date exists.</w:t>
       </w:r>
     </w:p>
-    <w:bookmarkEnd w:id="92"/>
-    <w:bookmarkStart w:id="96" w:name="what-going-wide-gets-you-instead"/>
+    <w:bookmarkEnd w:id="101"/>
+    <w:bookmarkStart w:id="105" w:name="what-going-wide-gets-you-instead"/>
     <w:p>
       <w:pPr>
         <w:pStyle w:val="Heading3"/>
@@ -9671,20 +9946,20 @@
       <w:r>
         <w:drawing>
           <wp:inline>
-            <wp:extent cx="4013200" cy="3088947"/>
+            <wp:extent cx="4013200" cy="3761178"/>
             <wp:effectExtent b="0" l="0" r="0" t="0"/>
-            <wp:docPr descr="" title="" id="94" name="Picture"/>
+            <wp:docPr descr="" title="" id="103" name="Picture"/>
             <a:graphic>
               <a:graphicData uri="http://schemas.openxmlformats.org/drawingml/2006/picture">
                 <pic:pic>
                   <pic:nvPicPr>
-                    <pic:cNvPr descr="figures/fig12_select_vs_wide.png" id="95" name="Picture"/>
+                    <pic:cNvPr descr="figures/fig12_select_vs_wide.png" id="104" name="Picture"/>
                     <pic:cNvPicPr>
                       <a:picLocks noChangeArrowheads="1" noChangeAspect="1"/>
                     </pic:cNvPicPr>
                   </pic:nvPicPr>
                   <pic:blipFill>
-                    <a:blip r:embed="rId93"/>
+                    <a:blip r:embed="rId102"/>
                     <a:stretch>
                       <a:fillRect/>
                     </a:stretch>
@@ -9692,7 +9967,7 @@
                   <pic:spPr bwMode="auto">
                     <a:xfrm>
                       <a:off x="0" y="0"/>
-                      <a:ext cx="4013200" cy="3088947"/>
+                      <a:ext cx="4013200" cy="3761178"/>
                     </a:xfrm>
                     <a:prstGeom prst="rect">
                       <a:avLst/>
@@ -9726,29 +10001,23 @@
         <w:t xml:space="preserve"> </w:t>
       </w:r>
       <w:r>
-        <w:t xml:space="preserve">— The trade-off in one picture: Select concentrates</w:t>
-      </w:r>
-      <w:r>
-        <w:t xml:space="preserve"> </w:t>
-      </w:r>
-      <w:r>
-        <w:t xml:space="preserve">distribution on one platform in exchange for Kindle Unlimited income and</w:t>
-      </w:r>
-      <w:r>
-        <w:t xml:space="preserve"> </w:t>
-      </w:r>
-      <w:r>
-        <w:t xml:space="preserve">promotional tools; wide trades that concentration for reach and independence</w:t>
-      </w:r>
-      <w:r>
-        <w:t xml:space="preserve"> </w:t>
-      </w:r>
-      <w:r>
-        <w:t xml:space="preserve">from any single platform’s rules.</w:t>
-      </w:r>
-    </w:p>
-    <w:bookmarkEnd w:id="96"/>
-    <w:bookmarkStart w:id="97" w:name="choosing-without-guessing"/>
+        <w:t xml:space="preserve">— Not a one-time choice: run one real 90-day term, then let</w:t>
+      </w:r>
+      <w:r>
+        <w:t xml:space="preserve"> </w:t>
+      </w:r>
+      <w:r>
+        <w:t xml:space="preserve">what actually happened to your page-reads make the next decision instead of</w:t>
+      </w:r>
+      <w:r>
+        <w:t xml:space="preserve"> </w:t>
+      </w:r>
+      <w:r>
+        <w:t xml:space="preserve">a genre-wide generalization.</w:t>
+      </w:r>
+    </w:p>
+    <w:bookmarkEnd w:id="105"/>
+    <w:bookmarkStart w:id="106" w:name="choosing-without-guessing"/>
     <w:p>
       <w:pPr>
         <w:pStyle w:val="Heading3"/>
@@ -9858,9 +10127,9 @@
         <w:t xml:space="preserve">why testing one real term beats assuming either way.</w:t>
       </w:r>
     </w:p>
-    <w:bookmarkEnd w:id="97"/>
-    <w:bookmarkEnd w:id="98"/>
-    <w:bookmarkStart w:id="107" w:name="chapter-13-avoiding-the-traps"/>
+    <w:bookmarkEnd w:id="106"/>
+    <w:bookmarkEnd w:id="107"/>
+    <w:bookmarkStart w:id="116" w:name="chapter-13-avoiding-the-traps"/>
     <w:p>
       <w:pPr>
         <w:pStyle w:val="Heading2"/>
@@ -9913,7 +10182,7 @@
         <w:t xml:space="preserve">doesn’t.</w:t>
       </w:r>
     </w:p>
-    <w:bookmarkStart w:id="99" w:name="vanity-and-predatory-hybrid-publishers"/>
+    <w:bookmarkStart w:id="108" w:name="vanity-and-predatory-hybrid-publishers"/>
     <w:p>
       <w:pPr>
         <w:pStyle w:val="Heading3"/>
@@ -10193,8 +10462,8 @@
         <w:t xml:space="preserve">instantly. A predatory hybrid publisher’s answer is deliberately vague.</w:t>
       </w:r>
     </w:p>
-    <w:bookmarkEnd w:id="99"/>
-    <w:bookmarkStart w:id="100" w:name="fake-reviews-and-rank-manipulation"/>
+    <w:bookmarkEnd w:id="108"/>
+    <w:bookmarkStart w:id="109" w:name="fake-reviews-and-rank-manipulation"/>
     <w:p>
       <w:pPr>
         <w:pStyle w:val="Heading3"/>
@@ -10319,8 +10588,8 @@
         <w:t xml:space="preserve">downside risk.</w:t>
       </w:r>
     </w:p>
-    <w:bookmarkEnd w:id="100"/>
-    <w:bookmarkStart w:id="101" w:name="ai-content-flooding"/>
+    <w:bookmarkEnd w:id="109"/>
+    <w:bookmarkStart w:id="110" w:name="ai-content-flooding"/>
     <w:p>
       <w:pPr>
         <w:pStyle w:val="Heading3"/>
@@ -10397,8 +10666,8 @@
         <w:t xml:space="preserve">”</w:t>
       </w:r>
     </w:p>
-    <w:bookmarkEnd w:id="101"/>
-    <w:bookmarkStart w:id="105" w:name="copyright-and-licensing-traps"/>
+    <w:bookmarkEnd w:id="110"/>
+    <w:bookmarkStart w:id="114" w:name="copyright-and-licensing-traps"/>
     <w:p>
       <w:pPr>
         <w:pStyle w:val="Heading3"/>
@@ -10509,18 +10778,18 @@
           <wp:inline>
             <wp:extent cx="4013200" cy="3371696"/>
             <wp:effectExtent b="0" l="0" r="0" t="0"/>
-            <wp:docPr descr="" title="" id="103" name="Picture"/>
+            <wp:docPr descr="" title="" id="112" name="Picture"/>
             <a:graphic>
               <a:graphicData uri="http://schemas.openxmlformats.org/drawingml/2006/picture">
                 <pic:pic>
                   <pic:nvPicPr>
-                    <pic:cNvPr descr="figures/fig13_red_flags.png" id="104" name="Picture"/>
+                    <pic:cNvPr descr="figures/fig13_red_flags.png" id="113" name="Picture"/>
                     <pic:cNvPicPr>
                       <a:picLocks noChangeArrowheads="1" noChangeAspect="1"/>
                     </pic:cNvPicPr>
                   </pic:nvPicPr>
                   <pic:blipFill>
-                    <a:blip r:embed="rId102"/>
+                    <a:blip r:embed="rId111"/>
                     <a:stretch>
                       <a:fillRect/>
                     </a:stretch>
@@ -10589,8 +10858,8 @@
         <w:t xml:space="preserve">your favor.</w:t>
       </w:r>
     </w:p>
-    <w:bookmarkEnd w:id="105"/>
-    <w:bookmarkStart w:id="106" w:name="X65e863de229a6fa8fe003fa9ba19edbdf74109c"/>
+    <w:bookmarkEnd w:id="114"/>
+    <w:bookmarkStart w:id="115" w:name="X65e863de229a6fa8fe003fa9ba19edbdf74109c"/>
     <w:p>
       <w:pPr>
         <w:pStyle w:val="Heading3"/>
@@ -10691,10 +10960,10 @@
         <w:t xml:space="preserve">attached. Often, it is.</w:t>
       </w:r>
     </w:p>
-    <w:bookmarkEnd w:id="106"/>
-    <w:bookmarkEnd w:id="107"/>
-    <w:bookmarkEnd w:id="108"/>
-    <w:bookmarkStart w:id="127" w:name="part-v-playing-the-long-game"/>
+    <w:bookmarkEnd w:id="115"/>
+    <w:bookmarkEnd w:id="116"/>
+    <w:bookmarkEnd w:id="117"/>
+    <w:bookmarkStart w:id="136" w:name="part-v-playing-the-long-game"/>
     <w:p>
       <w:pPr>
         <w:pStyle w:val="Heading1"/>
@@ -10703,7 +10972,7 @@
         <w:t xml:space="preserve">Part V — Playing the Long Game</w:t>
       </w:r>
     </w:p>
-    <w:bookmarkStart w:id="114" w:name="chapter-14-from-one-book-to-a-catalog"/>
+    <w:bookmarkStart w:id="123" w:name="chapter-14-from-one-book-to-a-catalog"/>
     <w:p>
       <w:pPr>
         <w:pStyle w:val="Heading2"/>
@@ -10757,7 +11026,7 @@
         <w:t xml:space="preserve">already in the catalog, not just its own.</w:t>
       </w:r>
     </w:p>
-    <w:bookmarkStart w:id="112" w:name="X2510e9c2be7d23f1b9e0fba598f214f9df463db"/>
+    <w:bookmarkStart w:id="121" w:name="X2510e9c2be7d23f1b9e0fba598f214f9df463db"/>
     <w:p>
       <w:pPr>
         <w:pStyle w:val="Heading3"/>
@@ -11121,18 +11390,18 @@
           <wp:inline>
             <wp:extent cx="4013200" cy="2578974"/>
             <wp:effectExtent b="0" l="0" r="0" t="0"/>
-            <wp:docPr descr="" title="" id="110" name="Picture"/>
+            <wp:docPr descr="" title="" id="119" name="Picture"/>
             <a:graphic>
               <a:graphicData uri="http://schemas.openxmlformats.org/drawingml/2006/picture">
                 <pic:pic>
                   <pic:nvPicPr>
-                    <pic:cNvPr descr="figures/fig14_catalog_compounding.png" id="111" name="Picture"/>
+                    <pic:cNvPr descr="figures/fig14_catalog_compounding.png" id="120" name="Picture"/>
                     <pic:cNvPicPr>
                       <a:picLocks noChangeArrowheads="1" noChangeAspect="1"/>
                     </pic:cNvPicPr>
                   </pic:nvPicPr>
                   <pic:blipFill>
-                    <a:blip r:embed="rId109"/>
+                    <a:blip r:embed="rId118"/>
                     <a:stretch>
                       <a:fillRect/>
                     </a:stretch>
@@ -11201,8 +11470,8 @@
         <w:t xml:space="preserve">and consistency of output.</w:t>
       </w:r>
     </w:p>
-    <w:bookmarkEnd w:id="112"/>
-    <w:bookmarkStart w:id="113" w:name="bundles-and-an-owned-audience"/>
+    <w:bookmarkEnd w:id="121"/>
+    <w:bookmarkStart w:id="122" w:name="bundles-and-an-owned-audience"/>
     <w:p>
       <w:pPr>
         <w:pStyle w:val="Heading3"/>
@@ -11326,9 +11595,9 @@
         <w:t xml:space="preserve">platform changing its rules on you.</w:t>
       </w:r>
     </w:p>
-    <w:bookmarkEnd w:id="113"/>
-    <w:bookmarkEnd w:id="114"/>
-    <w:bookmarkStart w:id="119" w:name="chapter-15-a-realistic-first-year-plan"/>
+    <w:bookmarkEnd w:id="122"/>
+    <w:bookmarkEnd w:id="123"/>
+    <w:bookmarkStart w:id="128" w:name="chapter-15-a-realistic-first-year-plan"/>
     <w:p>
       <w:pPr>
         <w:pStyle w:val="Heading2"/>
@@ -11460,7 +11729,7 @@
         <w:t xml:space="preserve">started.</w:t>
       </w:r>
     </w:p>
-    <w:bookmarkStart w:id="118" w:name="a-month-by-month-shape-for-a-first-book"/>
+    <w:bookmarkStart w:id="127" w:name="a-month-by-month-shape-for-a-first-book"/>
     <w:p>
       <w:pPr>
         <w:pStyle w:val="Heading3"/>
@@ -11708,18 +11977,18 @@
           <wp:inline>
             <wp:extent cx="4013200" cy="1921471"/>
             <wp:effectExtent b="0" l="0" r="0" t="0"/>
-            <wp:docPr descr="" title="" id="116" name="Picture"/>
+            <wp:docPr descr="" title="" id="125" name="Picture"/>
             <a:graphic>
               <a:graphicData uri="http://schemas.openxmlformats.org/drawingml/2006/picture">
                 <pic:pic>
                   <pic:nvPicPr>
-                    <pic:cNvPr descr="figures/fig15_first_year_roadmap.png" id="117" name="Picture"/>
+                    <pic:cNvPr descr="figures/fig15_first_year_roadmap.png" id="126" name="Picture"/>
                     <pic:cNvPicPr>
                       <a:picLocks noChangeArrowheads="1" noChangeAspect="1"/>
                     </pic:cNvPicPr>
                   </pic:nvPicPr>
                   <pic:blipFill>
-                    <a:blip r:embed="rId115"/>
+                    <a:blip r:embed="rId124"/>
                     <a:stretch>
                       <a:fillRect/>
                     </a:stretch>
@@ -11814,9 +12083,9 @@
         <w:t xml:space="preserve">and having become a self-publisher.</w:t>
       </w:r>
     </w:p>
-    <w:bookmarkEnd w:id="118"/>
-    <w:bookmarkEnd w:id="119"/>
-    <w:bookmarkStart w:id="120" w:name="appendix-a-the-one-page-launch-checklist"/>
+    <w:bookmarkEnd w:id="127"/>
+    <w:bookmarkEnd w:id="128"/>
+    <w:bookmarkStart w:id="129" w:name="appendix-a-the-one-page-launch-checklist"/>
     <w:p>
       <w:pPr>
         <w:pStyle w:val="Heading2"/>
@@ -12097,8 +12366,8 @@
         <w:t xml:space="preserve">one (Chapter 10)</w:t>
       </w:r>
     </w:p>
-    <w:bookmarkEnd w:id="120"/>
-    <w:bookmarkStart w:id="121" w:name="appendix-b-royalty-quick-reference"/>
+    <w:bookmarkEnd w:id="129"/>
+    <w:bookmarkStart w:id="130" w:name="appendix-b-royalty-quick-reference"/>
     <w:p>
       <w:pPr>
         <w:pStyle w:val="Heading2"/>
@@ -12259,8 +12528,8 @@
         <w:t xml:space="preserve">Break-even ACOS ≈ Royalty per copy ÷ Sale price × 100%</w:t>
       </w:r>
     </w:p>
-    <w:bookmarkEnd w:id="121"/>
-    <w:bookmarkStart w:id="125" w:name="Xc1a462834ef4c70435a2995a2a1442b2f067253"/>
+    <w:bookmarkEnd w:id="130"/>
+    <w:bookmarkStart w:id="134" w:name="Xc1a462834ef4c70435a2995a2a1442b2f067253"/>
     <w:p>
       <w:pPr>
         <w:pStyle w:val="Heading2"/>
@@ -12269,7 +12538,7 @@
         <w:t xml:space="preserve">Appendix C — ISBNs, Wide Distribution, and Further Reading</w:t>
       </w:r>
     </w:p>
-    <w:bookmarkStart w:id="122" w:name="isbns"/>
+    <w:bookmarkStart w:id="131" w:name="isbns"/>
     <w:p>
       <w:pPr>
         <w:pStyle w:val="Heading3"/>
@@ -12394,8 +12663,8 @@
         <w:t xml:space="preserve">need print-provider flexibility, buying your own is worth the cost.</w:t>
       </w:r>
     </w:p>
-    <w:bookmarkEnd w:id="122"/>
-    <w:bookmarkStart w:id="123" w:name="wide-distribution-tools"/>
+    <w:bookmarkEnd w:id="131"/>
+    <w:bookmarkStart w:id="132" w:name="wide-distribution-tools"/>
     <w:p>
       <w:pPr>
         <w:pStyle w:val="Heading3"/>
@@ -12454,8 +12723,8 @@
         <w:t xml:space="preserve">and distribution service in the indie-publishing space.</w:t>
       </w:r>
     </w:p>
-    <w:bookmarkEnd w:id="123"/>
-    <w:bookmarkStart w:id="124" w:name="further-reading-and-legitimate-resources"/>
+    <w:bookmarkEnd w:id="132"/>
+    <w:bookmarkStart w:id="133" w:name="further-reading-and-legitimate-resources"/>
     <w:p>
       <w:pPr>
         <w:pStyle w:val="Heading3"/>
@@ -12611,9 +12880,9 @@
         <w:t xml:space="preserve">general terms.</w:t>
       </w:r>
     </w:p>
-    <w:bookmarkEnd w:id="124"/>
-    <w:bookmarkEnd w:id="125"/>
-    <w:bookmarkStart w:id="126" w:name="a-closing-word"/>
+    <w:bookmarkEnd w:id="133"/>
+    <w:bookmarkEnd w:id="134"/>
+    <w:bookmarkStart w:id="135" w:name="a-closing-word"/>
     <w:p>
       <w:pPr>
         <w:pStyle w:val="Heading2"/>
@@ -12710,8 +12979,8 @@
         <w:t xml:space="preserve">finding.</w:t>
       </w:r>
     </w:p>
-    <w:bookmarkEnd w:id="126"/>
-    <w:bookmarkEnd w:id="127"/>
+    <w:bookmarkEnd w:id="135"/>
+    <w:bookmarkEnd w:id="136"/>
     <w:sectPr>
       <w:pgSz w:h="12960" w:w="8640"/>
       <w:pgMar w:bottom="1152" w:footer="720" w:gutter="288" w:header="720" w:left="1296" w:right="1008" w:top="1152"/>

</xml_diff>